<commit_message>
Expand personnel event transitions and add mode selection controls
</commit_message>
<xml_diff>
--- a/PROJECTS_EXCEL/workbook/PersonalEventBuilder/{yyyy}-{mm}-{dd} №{OrderNum} ({Signatory}) (Александр).docx
+++ b/PROJECTS_EXCEL/workbook/PersonalEventBuilder/{yyyy}-{mm}-{dd} №{OrderNum} ({Signatory}) (Александр).docx
@@ -22,7 +22,7 @@
           <w:lang w:val="uk-UA"/>
         </w:rPr>
         <w:drawing>
-          <wp:anchor distT="0" distB="0" distL="114300" distR="114300" simplePos="0" relativeHeight="251659264" behindDoc="0" locked="0" layoutInCell="1" allowOverlap="1" wp14:anchorId="4EF865A1" wp14:editId="2A5FB1FF">
+          <wp:anchor distT="0" distB="0" distL="114300" distR="114300" simplePos="0" relativeHeight="251659264" behindDoc="0" locked="0" layoutInCell="1" allowOverlap="1" wp14:anchorId="5ACE57EC" wp14:editId="390FDE43">
             <wp:simplePos x="0" y="0"/>
             <wp:positionH relativeFrom="margin">
               <wp:align>center</wp:align>
@@ -2321,6 +2321,237 @@
         <w:rPr>
           <w:lang w:val="uk-UA"/>
         </w:rPr>
+        <w:t>{\export:MoveFromMedicalCompanyForTreatmentToVacationForCuring_Begin}</w:t>
+      </w:r>
+    </w:p>
+    <w:p>
+      <w:pPr>
+        <w:rPr>
+          <w:lang w:val="uk-UA"/>
+        </w:rPr>
+      </w:pPr>
+      <w:r>
+        <w:rPr>
+          <w:lang w:val="uk-UA"/>
+        </w:rPr>
+        <w:t>{\export:MoveFromMedicalCompanyForTreatmentToVacationForCuring_End}</w:t>
+      </w:r>
+    </w:p>
+    <w:p>
+      <w:pPr>
+        <w:rPr>
+          <w:lang w:val="uk-UA"/>
+        </w:rPr>
+      </w:pPr>
+    </w:p>
+    <w:p>
+      <w:pPr>
+        <w:rPr>
+          <w:lang w:val="uk-UA"/>
+        </w:rPr>
+      </w:pPr>
+      <w:r>
+        <w:rPr>
+          <w:lang w:val="uk-UA"/>
+        </w:rPr>
+        <w:t>{\export:MoveFromMedicalCompanyVacationForCuringToHospital_Begin}</w:t>
+      </w:r>
+    </w:p>
+    <w:p>
+      <w:pPr>
+        <w:rPr>
+          <w:lang w:val="uk-UA"/>
+        </w:rPr>
+      </w:pPr>
+      <w:r>
+        <w:rPr>
+          <w:lang w:val="uk-UA"/>
+        </w:rPr>
+        <w:t>{\export:MoveFromMedicalCompanyVacationForCuringToHospital_End}</w:t>
+      </w:r>
+    </w:p>
+    <w:p>
+      <w:pPr>
+        <w:rPr>
+          <w:lang w:val="uk-UA"/>
+        </w:rPr>
+      </w:pPr>
+    </w:p>
+    <w:p>
+      <w:pPr>
+        <w:rPr>
+          <w:lang w:val="uk-UA"/>
+        </w:rPr>
+      </w:pPr>
+      <w:r>
+        <w:rPr>
+          <w:lang w:val="uk-UA"/>
+        </w:rPr>
+        <w:t>{\export:MoveFromMedicalCompanyVacationForCuringToVacationForCuring_Begin}</w:t>
+      </w:r>
+    </w:p>
+    <w:p>
+      <w:pPr>
+        <w:rPr>
+          <w:lang w:val="uk-UA"/>
+        </w:rPr>
+      </w:pPr>
+      <w:r>
+        <w:rPr>
+          <w:lang w:val="uk-UA"/>
+        </w:rPr>
+        <w:t>{\export:MoveFromMedicalCompanyVacationForCuringToVacationForCuring_End}</w:t>
+      </w:r>
+    </w:p>
+    <w:p>
+      <w:pPr>
+        <w:rPr>
+          <w:lang w:val="uk-UA"/>
+        </w:rPr>
+      </w:pPr>
+    </w:p>
+    <w:p>
+      <w:pPr>
+        <w:rPr>
+          <w:lang w:val="uk-UA"/>
+        </w:rPr>
+      </w:pPr>
+      <w:r>
+        <w:rPr>
+          <w:lang w:val="uk-UA"/>
+        </w:rPr>
+        <w:t>{\export:MoveFromOutpatientVlkToVacationForCuring_Begin}</w:t>
+      </w:r>
+    </w:p>
+    <w:p>
+      <w:pPr>
+        <w:rPr>
+          <w:lang w:val="uk-UA"/>
+        </w:rPr>
+      </w:pPr>
+      <w:r>
+        <w:rPr>
+          <w:lang w:val="uk-UA"/>
+        </w:rPr>
+        <w:t>{\export:MoveFromOutpatientVlkToVacationForCuring_End}</w:t>
+      </w:r>
+    </w:p>
+    <w:p>
+      <w:pPr>
+        <w:rPr>
+          <w:lang w:val="uk-UA"/>
+        </w:rPr>
+      </w:pPr>
+    </w:p>
+    <w:p>
+      <w:pPr>
+        <w:rPr>
+          <w:lang w:val="uk-UA"/>
+        </w:rPr>
+      </w:pPr>
+      <w:r>
+        <w:rPr>
+          <w:lang w:val="uk-UA"/>
+        </w:rPr>
+        <w:t>{\export:MoveFromVacationForCuringToAnnualVacation_Begin}</w:t>
+      </w:r>
+    </w:p>
+    <w:p>
+      <w:pPr>
+        <w:rPr>
+          <w:lang w:val="uk-UA"/>
+        </w:rPr>
+      </w:pPr>
+      <w:r>
+        <w:rPr>
+          <w:lang w:val="uk-UA"/>
+        </w:rPr>
+        <w:t>{\export:MoveFromVacationForCuringToAnnualVacation_End}</w:t>
+      </w:r>
+    </w:p>
+    <w:p>
+      <w:pPr>
+        <w:rPr>
+          <w:lang w:val="uk-UA"/>
+        </w:rPr>
+      </w:pPr>
+    </w:p>
+    <w:p>
+      <w:pPr>
+        <w:rPr>
+          <w:lang w:val="uk-UA"/>
+        </w:rPr>
+      </w:pPr>
+      <w:r>
+        <w:rPr>
+          <w:lang w:val="uk-UA"/>
+        </w:rPr>
+        <w:t>{\export:MoveFromAnnualVacationToVacationForCuring_Begin}</w:t>
+      </w:r>
+    </w:p>
+    <w:p>
+      <w:pPr>
+        <w:rPr>
+          <w:lang w:val="uk-UA"/>
+        </w:rPr>
+      </w:pPr>
+      <w:r>
+        <w:rPr>
+          <w:lang w:val="uk-UA"/>
+        </w:rPr>
+        <w:t>{\export:MoveFromAnnualVacationToVacationForCuring_End}</w:t>
+      </w:r>
+    </w:p>
+    <w:p>
+      <w:pPr>
+        <w:rPr>
+          <w:lang w:val="uk-UA"/>
+        </w:rPr>
+      </w:pPr>
+    </w:p>
+    <w:p>
+      <w:pPr>
+        <w:rPr>
+          <w:lang w:val="uk-UA"/>
+        </w:rPr>
+      </w:pPr>
+      <w:r>
+        <w:rPr>
+          <w:lang w:val="uk-UA"/>
+        </w:rPr>
+        <w:t>{\export:MoveFromFamilyVacationToVacationForCuring_Begin}</w:t>
+      </w:r>
+    </w:p>
+    <w:p>
+      <w:pPr>
+        <w:rPr>
+          <w:lang w:val="uk-UA"/>
+        </w:rPr>
+      </w:pPr>
+      <w:r>
+        <w:rPr>
+          <w:lang w:val="uk-UA"/>
+        </w:rPr>
+        <w:t>{\export:MoveFromFamilyVacationToVacationForCuring_End}</w:t>
+      </w:r>
+    </w:p>
+    <w:p>
+      <w:pPr>
+        <w:rPr>
+          <w:lang w:val="uk-UA"/>
+        </w:rPr>
+      </w:pPr>
+    </w:p>
+    <w:p>
+      <w:pPr>
+        <w:rPr>
+          <w:lang w:val="uk-UA"/>
+        </w:rPr>
+      </w:pPr>
+      <w:r>
+        <w:rPr>
+          <w:lang w:val="uk-UA"/>
+        </w:rPr>
         <w:t>{\export:MoveFromVacationForCuringToVacationForCuring_Begin}</w:t>
       </w:r>
     </w:p>
@@ -2657,7 +2888,6 @@
         <w:rPr>
           <w:lang w:val="uk-UA"/>
         </w:rPr>
-        <w:lastRenderedPageBreak/>
         <w:t>{\export:</w:t>
       </w:r>
       <w:r>

</xml_diff>

<commit_message>
Optimize conditional Word block cleanup and restore export spacing
</commit_message>
<xml_diff>
--- a/PROJECTS_EXCEL/workbook/PersonalEventBuilder/{yyyy}-{mm}-{dd} №{OrderNum} ({Signatory}) (Александр).docx
+++ b/PROJECTS_EXCEL/workbook/PersonalEventBuilder/{yyyy}-{mm}-{dd} №{OrderNum} ({Signatory}) (Александр).docx
@@ -22,7 +22,7 @@
           <w:lang w:val="uk-UA"/>
         </w:rPr>
         <w:drawing>
-          <wp:anchor distT="0" distB="0" distL="114300" distR="114300" simplePos="0" relativeHeight="251659264" behindDoc="0" locked="0" layoutInCell="1" allowOverlap="1" wp14:anchorId="5ACE57EC" wp14:editId="390FDE43">
+          <wp:anchor distT="0" distB="0" distL="114300" distR="114300" simplePos="0" relativeHeight="251659264" behindDoc="0" locked="0" layoutInCell="1" allowOverlap="1" wp14:anchorId="7B6EA6B4" wp14:editId="5EFE49FD">
             <wp:simplePos x="0" y="0"/>
             <wp:positionH relativeFrom="margin">
               <wp:align>center</wp:align>
@@ -254,7 +254,6 @@
         </w:rPr>
         <w:t>{</w:t>
       </w:r>
-      <w:proofErr w:type="gramStart"/>
       <w:r>
         <w:rPr>
           <w:szCs w:val="28"/>
@@ -282,7 +281,6 @@
         </w:rPr>
         <w:t>{</w:t>
       </w:r>
-      <w:proofErr w:type="gramEnd"/>
       <w:r>
         <w:rPr>
           <w:szCs w:val="28"/>
@@ -399,7 +397,7 @@
     <w:p>
       <w:pPr>
         <w:pStyle w:val="ListParagraph"/>
-        <w:ind w:left="709" w:firstLine="0"/>
+        <w:ind w:left="0"/>
         <w:rPr>
           <w:szCs w:val="28"/>
           <w:lang w:val="uk-UA"/>
@@ -681,6 +679,8 @@
     </w:p>
     <w:p>
       <w:pPr>
+        <w:pStyle w:val="ListParagraph"/>
+        <w:ind w:left="709" w:firstLine="0"/>
         <w:rPr>
           <w:szCs w:val="28"/>
           <w:lang w:val="uk-UA"/>
@@ -753,7 +753,19 @@
         <w:t xml:space="preserve"> на продовольче забезпечення з </w:t>
       </w:r>
       <w:r>
-        <w:t>{dd}</w:t>
+        <w:rPr>
+          <w:lang w:val="uk-UA"/>
+        </w:rPr>
+        <w:t>{</w:t>
+      </w:r>
+      <w:r>
+        <w:t>dd</w:t>
+      </w:r>
+      <w:r>
+        <w:rPr>
+          <w:lang w:val="uk-UA"/>
+        </w:rPr>
+        <w:t>}</w:t>
       </w:r>
       <w:r>
         <w:rPr>
@@ -830,14 +842,19 @@
     </w:p>
     <w:p>
       <w:pPr>
-        <w:pStyle w:val="ListParagraph"/>
-        <w:ind w:left="709" w:firstLine="0"/>
-        <w:rPr>
-          <w:szCs w:val="28"/>
-          <w:lang w:val="uk-UA"/>
-        </w:rPr>
-      </w:pPr>
-    </w:p>
+        <w:ind w:firstLine="0"/>
+        <w:rPr>
+          <w:lang w:val="uk-UA"/>
+        </w:rPr>
+      </w:pPr>
+      <w:r>
+        <w:rPr>
+          <w:lang w:val="uk-UA"/>
+        </w:rPr>
+        <w:t>{\block:FromBusinessTrip_Begin}</w:t>
+      </w:r>
+    </w:p>
+    <w:p/>
     <w:p>
       <w:pPr>
         <w:pStyle w:val="ListParagraph"/>
@@ -855,27 +872,18 @@
           <w:highlight w:val="yellow"/>
           <w:lang w:val="uk-UA"/>
         </w:rPr>
-        <w:t xml:space="preserve">З </w:t>
+        <w:t>З відрядження</w:t>
       </w:r>
       <w:r>
         <w:rPr>
           <w:highlight w:val="yellow"/>
           <w:lang w:val="uk-UA"/>
         </w:rPr>
-        <w:t>відрядження</w:t>
-      </w:r>
-      <w:r>
-        <w:rPr>
-          <w:highlight w:val="yellow"/>
-          <w:lang w:val="uk-UA"/>
-        </w:rPr>
         <w:t>:</w:t>
       </w:r>
     </w:p>
     <w:p>
       <w:pPr>
-        <w:pStyle w:val="ListParagraph"/>
-        <w:ind w:left="709" w:firstLine="0"/>
         <w:rPr>
           <w:lang w:val="uk-UA"/>
         </w:rPr>
@@ -893,12 +901,14 @@
         </w:rPr>
         <w:t>{\export:</w:t>
       </w:r>
+      <w:bookmarkStart w:id="0" w:name="_Hlk243735684"/>
       <w:r>
         <w:rPr>
           <w:lang w:val="uk-UA"/>
         </w:rPr>
         <w:t>FromBusinessTrip</w:t>
       </w:r>
+      <w:bookmarkEnd w:id="0"/>
       <w:r>
         <w:rPr>
           <w:lang w:val="uk-UA"/>
@@ -933,14 +943,33 @@
     </w:p>
     <w:p>
       <w:pPr>
-        <w:pStyle w:val="ListParagraph"/>
-        <w:ind w:left="709" w:firstLine="0"/>
-        <w:rPr>
-          <w:szCs w:val="28"/>
-          <w:lang w:val="uk-UA"/>
-        </w:rPr>
-      </w:pPr>
-    </w:p>
+        <w:ind w:firstLine="0"/>
+        <w:rPr>
+          <w:lang w:val="uk-UA"/>
+        </w:rPr>
+      </w:pPr>
+      <w:r>
+        <w:rPr>
+          <w:lang w:val="uk-UA"/>
+        </w:rPr>
+        <w:t>{\block:FromBusinessTrip_End}</w:t>
+      </w:r>
+    </w:p>
+    <w:p>
+      <w:pPr>
+        <w:ind w:firstLine="0"/>
+        <w:rPr>
+          <w:lang w:val="uk-UA"/>
+        </w:rPr>
+      </w:pPr>
+      <w:r>
+        <w:rPr>
+          <w:lang w:val="uk-UA"/>
+        </w:rPr>
+        <w:t>{\block:FromHospital_Begin}</w:t>
+      </w:r>
+    </w:p>
+    <w:p/>
     <w:p>
       <w:pPr>
         <w:pStyle w:val="ListParagraph"/>
@@ -963,8 +992,6 @@
     </w:p>
     <w:p>
       <w:pPr>
-        <w:pStyle w:val="ListParagraph"/>
-        <w:ind w:left="709" w:firstLine="0"/>
         <w:rPr>
           <w:lang w:val="uk-UA"/>
         </w:rPr>
@@ -998,13 +1025,33 @@
     </w:p>
     <w:p>
       <w:pPr>
-        <w:pStyle w:val="ListParagraph"/>
-        <w:ind w:left="0"/>
-        <w:rPr>
-          <w:lang w:val="uk-UA"/>
-        </w:rPr>
-      </w:pPr>
-    </w:p>
+        <w:ind w:firstLine="0"/>
+        <w:rPr>
+          <w:lang w:val="uk-UA"/>
+        </w:rPr>
+      </w:pPr>
+      <w:r>
+        <w:rPr>
+          <w:lang w:val="uk-UA"/>
+        </w:rPr>
+        <w:t>{\block:FromHospital_End}</w:t>
+      </w:r>
+    </w:p>
+    <w:p>
+      <w:pPr>
+        <w:ind w:firstLine="0"/>
+        <w:rPr>
+          <w:lang w:val="uk-UA"/>
+        </w:rPr>
+      </w:pPr>
+      <w:r>
+        <w:rPr>
+          <w:lang w:val="uk-UA"/>
+        </w:rPr>
+        <w:t>{\block:FromVacationForCuring_Begin}</w:t>
+      </w:r>
+    </w:p>
+    <w:p/>
     <w:p>
       <w:pPr>
         <w:pStyle w:val="ListParagraph"/>
@@ -1027,8 +1074,6 @@
     </w:p>
     <w:p>
       <w:pPr>
-        <w:pStyle w:val="ListParagraph"/>
-        <w:ind w:left="709" w:firstLine="0"/>
         <w:rPr>
           <w:lang w:val="uk-UA"/>
         </w:rPr>
@@ -1057,18 +1102,39 @@
         <w:rPr>
           <w:lang w:val="uk-UA"/>
         </w:rPr>
+        <w:lastRenderedPageBreak/>
         <w:t>{\export:FromVacationForCuring_End}</w:t>
       </w:r>
     </w:p>
     <w:p>
       <w:pPr>
-        <w:pStyle w:val="ListParagraph"/>
-        <w:ind w:left="709" w:firstLine="0"/>
-        <w:rPr>
-          <w:lang w:val="uk-UA"/>
-        </w:rPr>
-      </w:pPr>
-    </w:p>
+        <w:ind w:firstLine="0"/>
+        <w:rPr>
+          <w:lang w:val="uk-UA"/>
+        </w:rPr>
+      </w:pPr>
+      <w:r>
+        <w:rPr>
+          <w:lang w:val="uk-UA"/>
+        </w:rPr>
+        <w:t>{\block:FromVacationForCuring_End}</w:t>
+      </w:r>
+    </w:p>
+    <w:p>
+      <w:pPr>
+        <w:ind w:firstLine="0"/>
+        <w:rPr>
+          <w:lang w:val="uk-UA"/>
+        </w:rPr>
+      </w:pPr>
+      <w:r>
+        <w:rPr>
+          <w:lang w:val="uk-UA"/>
+        </w:rPr>
+        <w:t>{\block:FromAnnualMainVacation_Begin}</w:t>
+      </w:r>
+    </w:p>
+    <w:p/>
     <w:p>
       <w:pPr>
         <w:pStyle w:val="ListParagraph"/>
@@ -1119,17 +1185,38 @@
         <w:rPr>
           <w:lang w:val="uk-UA"/>
         </w:rPr>
-        <w:lastRenderedPageBreak/>
         <w:t>{\export:FromAnnualMainVacation_End}</w:t>
       </w:r>
     </w:p>
     <w:p>
       <w:pPr>
-        <w:rPr>
-          <w:lang w:val="uk-UA"/>
-        </w:rPr>
-      </w:pPr>
-    </w:p>
+        <w:ind w:firstLine="0"/>
+        <w:rPr>
+          <w:lang w:val="uk-UA"/>
+        </w:rPr>
+      </w:pPr>
+      <w:r>
+        <w:rPr>
+          <w:lang w:val="uk-UA"/>
+        </w:rPr>
+        <w:t>{\block:FromAnnualMainVacation_End}</w:t>
+      </w:r>
+    </w:p>
+    <w:p>
+      <w:pPr>
+        <w:ind w:firstLine="0"/>
+        <w:rPr>
+          <w:lang w:val="uk-UA"/>
+        </w:rPr>
+      </w:pPr>
+      <w:r>
+        <w:rPr>
+          <w:lang w:val="uk-UA"/>
+        </w:rPr>
+        <w:t>{\block:FromVacationForFamily_Begin}</w:t>
+      </w:r>
+    </w:p>
+    <w:p/>
     <w:p>
       <w:pPr>
         <w:pStyle w:val="ListParagraph"/>
@@ -1166,8 +1253,6 @@
     </w:p>
     <w:p>
       <w:pPr>
-        <w:pStyle w:val="ListParagraph"/>
-        <w:ind w:left="709" w:firstLine="0"/>
         <w:rPr>
           <w:lang w:val="uk-UA"/>
         </w:rPr>
@@ -1201,11 +1286,35 @@
     </w:p>
     <w:p>
       <w:pPr>
-        <w:rPr>
-          <w:lang w:val="uk-UA"/>
-        </w:rPr>
-      </w:pPr>
-    </w:p>
+        <w:ind w:firstLine="0"/>
+        <w:rPr>
+          <w:lang w:val="uk-UA"/>
+        </w:rPr>
+      </w:pPr>
+      <w:r>
+        <w:rPr>
+          <w:lang w:val="uk-UA"/>
+        </w:rPr>
+        <w:t>{\block:FromVacationForFamily_End}</w:t>
+      </w:r>
+    </w:p>
+    <w:p>
+      <w:pPr>
+        <w:ind w:firstLine="0"/>
+        <w:rPr>
+          <w:color w:val="000000"/>
+          <w:szCs w:val="28"/>
+        </w:rPr>
+      </w:pPr>
+      <w:r>
+        <w:rPr>
+          <w:color w:val="000000"/>
+          <w:szCs w:val="28"/>
+        </w:rPr>
+        <w:t>{\block:FromExternalVlk_Begin}</w:t>
+      </w:r>
+    </w:p>
+    <w:p/>
     <w:p>
       <w:pPr>
         <w:pStyle w:val="ListParagraph"/>
@@ -1252,7 +1361,6 @@
         <w:rPr>
           <w:color w:val="000000"/>
           <w:szCs w:val="28"/>
-          <w:lang w:val="uk-UA"/>
         </w:rPr>
       </w:pPr>
     </w:p>
@@ -1274,14 +1382,7 @@
         <w:rPr>
           <w:szCs w:val="28"/>
         </w:rPr>
-        <w:t>\</w:t>
-      </w:r>
-      <w:proofErr w:type="gramStart"/>
-      <w:r>
-        <w:rPr>
-          <w:szCs w:val="28"/>
-        </w:rPr>
-        <w:t>export:</w:t>
+        <w:t>\export:</w:t>
       </w:r>
       <w:r>
         <w:rPr>
@@ -1304,7 +1405,6 @@
         </w:rPr>
         <w:t>Vlk</w:t>
       </w:r>
-      <w:proofErr w:type="gramEnd"/>
       <w:r>
         <w:rPr>
           <w:szCs w:val="28"/>
@@ -1338,14 +1438,7 @@
         <w:rPr>
           <w:szCs w:val="28"/>
         </w:rPr>
-        <w:t>\</w:t>
-      </w:r>
-      <w:proofErr w:type="gramStart"/>
-      <w:r>
-        <w:rPr>
-          <w:szCs w:val="28"/>
-        </w:rPr>
-        <w:t>export:</w:t>
+        <w:t>\export:</w:t>
       </w:r>
       <w:r>
         <w:rPr>
@@ -1368,7 +1461,6 @@
         </w:rPr>
         <w:t>Vlk</w:t>
       </w:r>
-      <w:proofErr w:type="gramEnd"/>
       <w:r>
         <w:rPr>
           <w:szCs w:val="28"/>
@@ -1385,12 +1477,36 @@
     </w:p>
     <w:p>
       <w:pPr>
+        <w:ind w:firstLine="0"/>
         <w:rPr>
           <w:color w:val="000000"/>
           <w:szCs w:val="28"/>
-        </w:rPr>
-      </w:pPr>
-    </w:p>
+          <w:lang w:val="uk-UA"/>
+        </w:rPr>
+      </w:pPr>
+      <w:r>
+        <w:rPr>
+          <w:color w:val="000000"/>
+          <w:szCs w:val="28"/>
+        </w:rPr>
+        <w:t>{\block:FromExternalVlk_End}</w:t>
+      </w:r>
+    </w:p>
+    <w:p>
+      <w:pPr>
+        <w:ind w:firstLine="0"/>
+        <w:rPr>
+          <w:lang w:val="uk-UA"/>
+        </w:rPr>
+      </w:pPr>
+      <w:r>
+        <w:rPr>
+          <w:lang w:val="uk-UA"/>
+        </w:rPr>
+        <w:t>{\block:FromMedicalCompanyForTreatment_Begin}</w:t>
+      </w:r>
+    </w:p>
+    <w:p/>
     <w:p>
       <w:pPr>
         <w:pStyle w:val="ListParagraph"/>
@@ -1442,8 +1558,6 @@
     <w:p>
       <w:pPr>
         <w:rPr>
-          <w:rFonts w:cs="Times New Roman"/>
-          <w:szCs w:val="28"/>
           <w:lang w:val="uk-UA"/>
         </w:rPr>
       </w:pPr>
@@ -1500,12 +1614,17 @@
     </w:p>
     <w:p>
       <w:pPr>
-        <w:rPr>
-          <w:color w:val="000000"/>
-          <w:szCs w:val="28"/>
-          <w:lang w:val="uk-UA"/>
-        </w:rPr>
-      </w:pPr>
+        <w:ind w:firstLine="0"/>
+        <w:rPr>
+          <w:lang w:val="uk-UA"/>
+        </w:rPr>
+      </w:pPr>
+      <w:r>
+        <w:rPr>
+          <w:lang w:val="uk-UA"/>
+        </w:rPr>
+        <w:t>{\block:FromMedicalCompanyForTreatment_End}</w:t>
+      </w:r>
     </w:p>
     <w:p>
       <w:pPr>
@@ -1537,15 +1656,6 @@
         </w:rPr>
         <w:t>СЗЧ</w:t>
       </w:r>
-    </w:p>
-    <w:p>
-      <w:pPr>
-        <w:rPr>
-          <w:color w:val="000000"/>
-          <w:szCs w:val="28"/>
-          <w:lang w:val="uk-UA"/>
-        </w:rPr>
-      </w:pPr>
     </w:p>
     <w:p>
       <w:pPr>
@@ -1679,11 +1789,19 @@
     </w:p>
     <w:p>
       <w:pPr>
-        <w:rPr>
-          <w:lang w:val="uk-UA"/>
-        </w:rPr>
-      </w:pPr>
-    </w:p>
+        <w:ind w:firstLine="0"/>
+        <w:rPr>
+          <w:lang w:val="uk-UA"/>
+        </w:rPr>
+      </w:pPr>
+      <w:r>
+        <w:rPr>
+          <w:lang w:val="uk-UA"/>
+        </w:rPr>
+        <w:t>{\block:ToHospital_Begin}</w:t>
+      </w:r>
+    </w:p>
+    <w:p/>
     <w:p>
       <w:pPr>
         <w:pStyle w:val="ListParagraph"/>
@@ -1739,11 +1857,33 @@
     </w:p>
     <w:p>
       <w:pPr>
-        <w:rPr>
-          <w:lang w:val="uk-UA"/>
-        </w:rPr>
-      </w:pPr>
-    </w:p>
+        <w:ind w:firstLine="0"/>
+        <w:rPr>
+          <w:lang w:val="uk-UA"/>
+        </w:rPr>
+      </w:pPr>
+      <w:r>
+        <w:rPr>
+          <w:lang w:val="uk-UA"/>
+        </w:rPr>
+        <w:t>{\block:ToHospital_End}</w:t>
+      </w:r>
+    </w:p>
+    <w:p>
+      <w:pPr>
+        <w:ind w:firstLine="0"/>
+        <w:rPr>
+          <w:lang w:val="uk-UA"/>
+        </w:rPr>
+      </w:pPr>
+      <w:r>
+        <w:rPr>
+          <w:lang w:val="uk-UA"/>
+        </w:rPr>
+        <w:t>{\block:ToBusinessTrip_Begin}</w:t>
+      </w:r>
+    </w:p>
+    <w:p/>
     <w:p>
       <w:pPr>
         <w:pStyle w:val="ListParagraph"/>
@@ -1766,8 +1906,6 @@
     </w:p>
     <w:p>
       <w:pPr>
-        <w:pStyle w:val="ListParagraph"/>
-        <w:ind w:left="0"/>
         <w:rPr>
           <w:lang w:val="uk-UA"/>
         </w:rPr>
@@ -1801,11 +1939,33 @@
     </w:p>
     <w:p>
       <w:pPr>
-        <w:rPr>
-          <w:lang w:val="uk-UA"/>
-        </w:rPr>
-      </w:pPr>
-    </w:p>
+        <w:ind w:firstLine="0"/>
+        <w:rPr>
+          <w:lang w:val="uk-UA"/>
+        </w:rPr>
+      </w:pPr>
+      <w:r>
+        <w:rPr>
+          <w:lang w:val="uk-UA"/>
+        </w:rPr>
+        <w:t>{\block:ToBusinessTrip_End}</w:t>
+      </w:r>
+    </w:p>
+    <w:p>
+      <w:pPr>
+        <w:ind w:firstLine="0"/>
+        <w:rPr>
+          <w:lang w:val="uk-UA"/>
+        </w:rPr>
+      </w:pPr>
+      <w:r>
+        <w:rPr>
+          <w:lang w:val="uk-UA"/>
+        </w:rPr>
+        <w:t>{\block:ToAnnualMainVacation_Begin}</w:t>
+      </w:r>
+    </w:p>
+    <w:p/>
     <w:p>
       <w:pPr>
         <w:pStyle w:val="ListParagraph"/>
@@ -1855,8 +2015,6 @@
     </w:p>
     <w:p>
       <w:pPr>
-        <w:pStyle w:val="ListParagraph"/>
-        <w:ind w:left="0"/>
         <w:rPr>
           <w:lang w:val="uk-UA"/>
         </w:rPr>
@@ -1890,13 +2048,33 @@
     </w:p>
     <w:p>
       <w:pPr>
-        <w:pStyle w:val="ListParagraph"/>
-        <w:ind w:left="0"/>
-        <w:rPr>
-          <w:lang w:val="uk-UA"/>
-        </w:rPr>
-      </w:pPr>
-    </w:p>
+        <w:ind w:firstLine="0"/>
+        <w:rPr>
+          <w:lang w:val="uk-UA"/>
+        </w:rPr>
+      </w:pPr>
+      <w:r>
+        <w:rPr>
+          <w:lang w:val="uk-UA"/>
+        </w:rPr>
+        <w:t>{\block:ToAnnualMainVacation_End}</w:t>
+      </w:r>
+    </w:p>
+    <w:p>
+      <w:pPr>
+        <w:ind w:firstLine="0"/>
+        <w:rPr>
+          <w:lang w:val="uk-UA"/>
+        </w:rPr>
+      </w:pPr>
+      <w:r>
+        <w:rPr>
+          <w:lang w:val="uk-UA"/>
+        </w:rPr>
+        <w:t>{\block:ToVacationForFamily_Begin}</w:t>
+      </w:r>
+    </w:p>
+    <w:p/>
     <w:p>
       <w:pPr>
         <w:pStyle w:val="ListParagraph"/>
@@ -1919,10 +2097,7 @@
     </w:p>
     <w:p>
       <w:pPr>
-        <w:pStyle w:val="ListParagraph"/>
-        <w:ind w:left="709" w:firstLine="0"/>
-        <w:rPr>
-          <w:highlight w:val="yellow"/>
+        <w:rPr>
           <w:lang w:val="uk-UA"/>
         </w:rPr>
       </w:pPr>
@@ -1955,14 +2130,33 @@
     </w:p>
     <w:p>
       <w:pPr>
-        <w:pStyle w:val="ListParagraph"/>
-        <w:ind w:left="709" w:firstLine="0"/>
-        <w:rPr>
-          <w:highlight w:val="yellow"/>
-          <w:lang w:val="uk-UA"/>
-        </w:rPr>
-      </w:pPr>
-    </w:p>
+        <w:ind w:firstLine="0"/>
+        <w:rPr>
+          <w:lang w:val="uk-UA"/>
+        </w:rPr>
+      </w:pPr>
+      <w:r>
+        <w:rPr>
+          <w:lang w:val="uk-UA"/>
+        </w:rPr>
+        <w:t>{\block:ToVacationForFamily_End}</w:t>
+      </w:r>
+    </w:p>
+    <w:p>
+      <w:pPr>
+        <w:ind w:firstLine="0"/>
+        <w:rPr>
+          <w:lang w:val="uk-UA"/>
+        </w:rPr>
+      </w:pPr>
+      <w:r>
+        <w:rPr>
+          <w:lang w:val="uk-UA"/>
+        </w:rPr>
+        <w:t>{\block:ToVacationForCuring_Begin}</w:t>
+      </w:r>
+    </w:p>
+    <w:p/>
     <w:p>
       <w:pPr>
         <w:pStyle w:val="ListParagraph"/>
@@ -2025,11 +2219,33 @@
     </w:p>
     <w:p>
       <w:pPr>
-        <w:rPr>
-          <w:lang w:val="uk-UA"/>
-        </w:rPr>
-      </w:pPr>
-    </w:p>
+        <w:ind w:firstLine="0"/>
+        <w:rPr>
+          <w:lang w:val="uk-UA"/>
+        </w:rPr>
+      </w:pPr>
+      <w:r>
+        <w:rPr>
+          <w:lang w:val="uk-UA"/>
+        </w:rPr>
+        <w:t>{\block:ToVacationForCuring_End}</w:t>
+      </w:r>
+    </w:p>
+    <w:p>
+      <w:pPr>
+        <w:ind w:firstLine="0"/>
+        <w:rPr>
+          <w:lang w:val="uk-UA"/>
+        </w:rPr>
+      </w:pPr>
+      <w:r>
+        <w:rPr>
+          <w:lang w:val="uk-UA"/>
+        </w:rPr>
+        <w:t>{\block:ToMaternityLeave_Begin}</w:t>
+      </w:r>
+    </w:p>
+    <w:p/>
     <w:p>
       <w:pPr>
         <w:pStyle w:val="ListParagraph"/>
@@ -2116,13 +2332,33 @@
     </w:p>
     <w:p>
       <w:pPr>
-        <w:rPr>
-          <w:color w:val="000000"/>
-          <w:szCs w:val="28"/>
-          <w:lang w:val="uk-UA"/>
-        </w:rPr>
-      </w:pPr>
-    </w:p>
+        <w:ind w:firstLine="0"/>
+        <w:rPr>
+          <w:lang w:val="uk-UA"/>
+        </w:rPr>
+      </w:pPr>
+      <w:r>
+        <w:rPr>
+          <w:lang w:val="uk-UA"/>
+        </w:rPr>
+        <w:t>{\block:ToMaternityLeave_End}</w:t>
+      </w:r>
+    </w:p>
+    <w:p>
+      <w:pPr>
+        <w:ind w:firstLine="0"/>
+        <w:rPr>
+          <w:lang w:val="uk-UA"/>
+        </w:rPr>
+      </w:pPr>
+      <w:r>
+        <w:rPr>
+          <w:lang w:val="uk-UA"/>
+        </w:rPr>
+        <w:t>{\block:ToMedicalCompanyForTreatment_Begin}</w:t>
+      </w:r>
+    </w:p>
+    <w:p/>
     <w:p>
       <w:pPr>
         <w:pStyle w:val="ListParagraph"/>
@@ -2157,8 +2393,6 @@
     <w:p>
       <w:pPr>
         <w:rPr>
-          <w:rFonts w:cs="Times New Roman"/>
-          <w:szCs w:val="28"/>
           <w:lang w:val="uk-UA"/>
         </w:rPr>
       </w:pPr>
@@ -2221,10 +2455,17 @@
     </w:p>
     <w:p>
       <w:pPr>
-        <w:rPr>
-          <w:lang w:val="uk-UA"/>
-        </w:rPr>
-      </w:pPr>
+        <w:ind w:firstLine="0"/>
+        <w:rPr>
+          <w:lang w:val="uk-UA"/>
+        </w:rPr>
+      </w:pPr>
+      <w:r>
+        <w:rPr>
+          <w:lang w:val="uk-UA"/>
+        </w:rPr>
+        <w:t>{\block:ToMedicalCompanyForTreatment_End}</w:t>
+      </w:r>
     </w:p>
     <w:p>
       <w:pPr>
@@ -2272,12 +2513,19 @@
     </w:p>
     <w:p>
       <w:pPr>
-        <w:spacing w:line="247" w:lineRule="auto"/>
-        <w:rPr>
-          <w:lang w:val="uk-UA"/>
-        </w:rPr>
-      </w:pPr>
-    </w:p>
+        <w:ind w:firstLine="0"/>
+        <w:rPr>
+          <w:lang w:val="uk-UA"/>
+        </w:rPr>
+      </w:pPr>
+      <w:r>
+        <w:rPr>
+          <w:lang w:val="uk-UA"/>
+        </w:rPr>
+        <w:t>{\block:MoveFromHospitalToVacationForCuring_Begin}</w:t>
+      </w:r>
+    </w:p>
+    <w:p/>
     <w:p>
       <w:pPr>
         <w:rPr>
@@ -2301,16 +2549,39 @@
         <w:rPr>
           <w:lang w:val="uk-UA"/>
         </w:rPr>
+        <w:lastRenderedPageBreak/>
         <w:t>{\export:MoveFromHospitalToVacationForCuring_End}</w:t>
       </w:r>
     </w:p>
     <w:p>
       <w:pPr>
-        <w:rPr>
-          <w:lang w:val="uk-UA"/>
-        </w:rPr>
-      </w:pPr>
-    </w:p>
+        <w:ind w:firstLine="0"/>
+        <w:rPr>
+          <w:lang w:val="uk-UA"/>
+        </w:rPr>
+      </w:pPr>
+      <w:r>
+        <w:rPr>
+          <w:lang w:val="uk-UA"/>
+        </w:rPr>
+        <w:t>{\block:MoveFromHospitalToVacationForCuring_End}</w:t>
+      </w:r>
+    </w:p>
+    <w:p>
+      <w:pPr>
+        <w:ind w:firstLine="0"/>
+        <w:rPr>
+          <w:lang w:val="uk-UA"/>
+        </w:rPr>
+      </w:pPr>
+      <w:r>
+        <w:rPr>
+          <w:lang w:val="uk-UA"/>
+        </w:rPr>
+        <w:t>{\block:MoveFromMedicalCompanyForTreatmentToVacationForCuring_Begin}</w:t>
+      </w:r>
+    </w:p>
+    <w:p/>
     <w:p>
       <w:pPr>
         <w:rPr>
@@ -2339,11 +2610,33 @@
     </w:p>
     <w:p>
       <w:pPr>
-        <w:rPr>
-          <w:lang w:val="uk-UA"/>
-        </w:rPr>
-      </w:pPr>
-    </w:p>
+        <w:ind w:firstLine="0"/>
+        <w:rPr>
+          <w:lang w:val="uk-UA"/>
+        </w:rPr>
+      </w:pPr>
+      <w:r>
+        <w:rPr>
+          <w:lang w:val="uk-UA"/>
+        </w:rPr>
+        <w:t>{\block:MoveFromMedicalCompanyForTreatmentToVacationForCuring_End}</w:t>
+      </w:r>
+    </w:p>
+    <w:p>
+      <w:pPr>
+        <w:ind w:firstLine="0"/>
+        <w:rPr>
+          <w:lang w:val="uk-UA"/>
+        </w:rPr>
+      </w:pPr>
+      <w:r>
+        <w:rPr>
+          <w:lang w:val="uk-UA"/>
+        </w:rPr>
+        <w:t>{\block:MoveFromMedicalCompanyVacationForCuringToHospital_Begin}</w:t>
+      </w:r>
+    </w:p>
+    <w:p/>
     <w:p>
       <w:pPr>
         <w:rPr>
@@ -2372,11 +2665,33 @@
     </w:p>
     <w:p>
       <w:pPr>
-        <w:rPr>
-          <w:lang w:val="uk-UA"/>
-        </w:rPr>
-      </w:pPr>
-    </w:p>
+        <w:ind w:firstLine="0"/>
+        <w:rPr>
+          <w:lang w:val="uk-UA"/>
+        </w:rPr>
+      </w:pPr>
+      <w:r>
+        <w:rPr>
+          <w:lang w:val="uk-UA"/>
+        </w:rPr>
+        <w:t>{\block:MoveFromMedicalCompanyVacationForCuringToHospital_End}</w:t>
+      </w:r>
+    </w:p>
+    <w:p>
+      <w:pPr>
+        <w:ind w:firstLine="0"/>
+        <w:rPr>
+          <w:lang w:val="uk-UA"/>
+        </w:rPr>
+      </w:pPr>
+      <w:r>
+        <w:rPr>
+          <w:lang w:val="uk-UA"/>
+        </w:rPr>
+        <w:t>{\block:MoveFromMedicalCompanyVacationForCuringToVacationForCuring_Begin}</w:t>
+      </w:r>
+    </w:p>
+    <w:p/>
     <w:p>
       <w:pPr>
         <w:rPr>
@@ -2405,11 +2720,33 @@
     </w:p>
     <w:p>
       <w:pPr>
-        <w:rPr>
-          <w:lang w:val="uk-UA"/>
-        </w:rPr>
-      </w:pPr>
-    </w:p>
+        <w:ind w:firstLine="0"/>
+        <w:rPr>
+          <w:lang w:val="uk-UA"/>
+        </w:rPr>
+      </w:pPr>
+      <w:r>
+        <w:rPr>
+          <w:lang w:val="uk-UA"/>
+        </w:rPr>
+        <w:t>{\block:MoveFromMedicalCompanyVacationForCuringToVacationForCuring_End}</w:t>
+      </w:r>
+    </w:p>
+    <w:p>
+      <w:pPr>
+        <w:ind w:firstLine="0"/>
+        <w:rPr>
+          <w:lang w:val="uk-UA"/>
+        </w:rPr>
+      </w:pPr>
+      <w:r>
+        <w:rPr>
+          <w:lang w:val="uk-UA"/>
+        </w:rPr>
+        <w:t>{\block:MoveFromOutpatientVlkToVacationForCuring_Begin}</w:t>
+      </w:r>
+    </w:p>
+    <w:p/>
     <w:p>
       <w:pPr>
         <w:rPr>
@@ -2438,11 +2775,33 @@
     </w:p>
     <w:p>
       <w:pPr>
-        <w:rPr>
-          <w:lang w:val="uk-UA"/>
-        </w:rPr>
-      </w:pPr>
-    </w:p>
+        <w:ind w:firstLine="0"/>
+        <w:rPr>
+          <w:lang w:val="uk-UA"/>
+        </w:rPr>
+      </w:pPr>
+      <w:r>
+        <w:rPr>
+          <w:lang w:val="uk-UA"/>
+        </w:rPr>
+        <w:t>{\block:MoveFromOutpatientVlkToVacationForCuring_End}</w:t>
+      </w:r>
+    </w:p>
+    <w:p>
+      <w:pPr>
+        <w:ind w:firstLine="0"/>
+        <w:rPr>
+          <w:lang w:val="uk-UA"/>
+        </w:rPr>
+      </w:pPr>
+      <w:r>
+        <w:rPr>
+          <w:lang w:val="uk-UA"/>
+        </w:rPr>
+        <w:t>{\block:MoveFromVacationForCuringToAnnualVacation_Begin}</w:t>
+      </w:r>
+    </w:p>
+    <w:p/>
     <w:p>
       <w:pPr>
         <w:rPr>
@@ -2471,11 +2830,33 @@
     </w:p>
     <w:p>
       <w:pPr>
-        <w:rPr>
-          <w:lang w:val="uk-UA"/>
-        </w:rPr>
-      </w:pPr>
-    </w:p>
+        <w:ind w:firstLine="0"/>
+        <w:rPr>
+          <w:lang w:val="uk-UA"/>
+        </w:rPr>
+      </w:pPr>
+      <w:r>
+        <w:rPr>
+          <w:lang w:val="uk-UA"/>
+        </w:rPr>
+        <w:t>{\block:MoveFromVacationForCuringToAnnualVacation_End}</w:t>
+      </w:r>
+    </w:p>
+    <w:p>
+      <w:pPr>
+        <w:ind w:firstLine="0"/>
+        <w:rPr>
+          <w:lang w:val="uk-UA"/>
+        </w:rPr>
+      </w:pPr>
+      <w:r>
+        <w:rPr>
+          <w:lang w:val="uk-UA"/>
+        </w:rPr>
+        <w:t>{\block:MoveFromAnnualVacationToVacationForCuring_Begin}</w:t>
+      </w:r>
+    </w:p>
+    <w:p/>
     <w:p>
       <w:pPr>
         <w:rPr>
@@ -2504,11 +2885,33 @@
     </w:p>
     <w:p>
       <w:pPr>
-        <w:rPr>
-          <w:lang w:val="uk-UA"/>
-        </w:rPr>
-      </w:pPr>
-    </w:p>
+        <w:ind w:firstLine="0"/>
+        <w:rPr>
+          <w:lang w:val="uk-UA"/>
+        </w:rPr>
+      </w:pPr>
+      <w:r>
+        <w:rPr>
+          <w:lang w:val="uk-UA"/>
+        </w:rPr>
+        <w:t>{\block:MoveFromAnnualVacationToVacationForCuring_End}</w:t>
+      </w:r>
+    </w:p>
+    <w:p>
+      <w:pPr>
+        <w:ind w:firstLine="0"/>
+        <w:rPr>
+          <w:lang w:val="uk-UA"/>
+        </w:rPr>
+      </w:pPr>
+      <w:r>
+        <w:rPr>
+          <w:lang w:val="uk-UA"/>
+        </w:rPr>
+        <w:t>{\block:MoveFromFamilyVacationToVacationForCuring_Begin}</w:t>
+      </w:r>
+    </w:p>
+    <w:p/>
     <w:p>
       <w:pPr>
         <w:rPr>
@@ -2537,21 +2940,44 @@
     </w:p>
     <w:p>
       <w:pPr>
-        <w:rPr>
-          <w:lang w:val="uk-UA"/>
-        </w:rPr>
-      </w:pPr>
-    </w:p>
-    <w:p>
-      <w:pPr>
-        <w:rPr>
-          <w:lang w:val="uk-UA"/>
-        </w:rPr>
-      </w:pPr>
-      <w:r>
-        <w:rPr>
-          <w:lang w:val="uk-UA"/>
-        </w:rPr>
+        <w:ind w:firstLine="0"/>
+        <w:rPr>
+          <w:lang w:val="uk-UA"/>
+        </w:rPr>
+      </w:pPr>
+      <w:r>
+        <w:rPr>
+          <w:lang w:val="uk-UA"/>
+        </w:rPr>
+        <w:t>{\block:MoveFromFamilyVacationToVacationForCuring_End}</w:t>
+      </w:r>
+    </w:p>
+    <w:p>
+      <w:pPr>
+        <w:ind w:firstLine="0"/>
+        <w:rPr>
+          <w:lang w:val="uk-UA"/>
+        </w:rPr>
+      </w:pPr>
+      <w:r>
+        <w:rPr>
+          <w:lang w:val="uk-UA"/>
+        </w:rPr>
+        <w:t>{\block:MoveFromVacationForCuringToVacationForCuring_Begin}</w:t>
+      </w:r>
+    </w:p>
+    <w:p/>
+    <w:p>
+      <w:pPr>
+        <w:rPr>
+          <w:lang w:val="uk-UA"/>
+        </w:rPr>
+      </w:pPr>
+      <w:r>
+        <w:rPr>
+          <w:lang w:val="uk-UA"/>
+        </w:rPr>
+        <w:lastRenderedPageBreak/>
         <w:t>{\export:MoveFromVacationForCuringToVacationForCuring_Begin}</w:t>
       </w:r>
     </w:p>
@@ -2570,11 +2996,33 @@
     </w:p>
     <w:p>
       <w:pPr>
-        <w:rPr>
-          <w:lang w:val="uk-UA"/>
-        </w:rPr>
-      </w:pPr>
-    </w:p>
+        <w:ind w:firstLine="0"/>
+        <w:rPr>
+          <w:lang w:val="uk-UA"/>
+        </w:rPr>
+      </w:pPr>
+      <w:r>
+        <w:rPr>
+          <w:lang w:val="uk-UA"/>
+        </w:rPr>
+        <w:t>{\block:MoveFromVacationForCuringToVacationForCuring_End}</w:t>
+      </w:r>
+    </w:p>
+    <w:p>
+      <w:pPr>
+        <w:ind w:firstLine="0"/>
+        <w:rPr>
+          <w:lang w:val="uk-UA"/>
+        </w:rPr>
+      </w:pPr>
+      <w:r>
+        <w:rPr>
+          <w:lang w:val="uk-UA"/>
+        </w:rPr>
+        <w:t>{\block:MoveFromVacationForCuringToHospital_Begin}</w:t>
+      </w:r>
+    </w:p>
+    <w:p/>
     <w:p>
       <w:pPr>
         <w:rPr>
@@ -2603,11 +3051,33 @@
     </w:p>
     <w:p>
       <w:pPr>
-        <w:rPr>
-          <w:lang w:val="uk-UA"/>
-        </w:rPr>
-      </w:pPr>
-    </w:p>
+        <w:ind w:firstLine="0"/>
+        <w:rPr>
+          <w:lang w:val="uk-UA"/>
+        </w:rPr>
+      </w:pPr>
+      <w:r>
+        <w:rPr>
+          <w:lang w:val="uk-UA"/>
+        </w:rPr>
+        <w:t>{\block:MoveFromVacationForCuringToHospital_End}</w:t>
+      </w:r>
+    </w:p>
+    <w:p>
+      <w:pPr>
+        <w:ind w:firstLine="0"/>
+        <w:rPr>
+          <w:lang w:val="uk-UA"/>
+        </w:rPr>
+      </w:pPr>
+      <w:r>
+        <w:rPr>
+          <w:lang w:val="uk-UA"/>
+        </w:rPr>
+        <w:t>{\block:MoveFromAnnualVacationToHospital_Begin}</w:t>
+      </w:r>
+    </w:p>
+    <w:p/>
     <w:p>
       <w:pPr>
         <w:rPr>
@@ -2660,11 +3130,33 @@
     </w:p>
     <w:p>
       <w:pPr>
-        <w:rPr>
-          <w:lang w:val="uk-UA"/>
-        </w:rPr>
-      </w:pPr>
-    </w:p>
+        <w:ind w:firstLine="0"/>
+        <w:rPr>
+          <w:lang w:val="uk-UA"/>
+        </w:rPr>
+      </w:pPr>
+      <w:r>
+        <w:rPr>
+          <w:lang w:val="uk-UA"/>
+        </w:rPr>
+        <w:t>{\block:MoveFromAnnualVacationToHospital_End}</w:t>
+      </w:r>
+    </w:p>
+    <w:p>
+      <w:pPr>
+        <w:ind w:firstLine="0"/>
+        <w:rPr>
+          <w:lang w:val="uk-UA"/>
+        </w:rPr>
+      </w:pPr>
+      <w:r>
+        <w:rPr>
+          <w:lang w:val="uk-UA"/>
+        </w:rPr>
+        <w:t>{\block:MoveFromMedicalCompanyForTreatmentToHospital_Begin}</w:t>
+      </w:r>
+    </w:p>
+    <w:p/>
     <w:p>
       <w:pPr>
         <w:rPr>
@@ -2717,11 +3209,33 @@
     </w:p>
     <w:p>
       <w:pPr>
-        <w:rPr>
-          <w:lang w:val="uk-UA"/>
-        </w:rPr>
-      </w:pPr>
-    </w:p>
+        <w:ind w:firstLine="0"/>
+        <w:rPr>
+          <w:lang w:val="uk-UA"/>
+        </w:rPr>
+      </w:pPr>
+      <w:r>
+        <w:rPr>
+          <w:lang w:val="uk-UA"/>
+        </w:rPr>
+        <w:t>{\block:MoveFromMedicalCompanyForTreatmentToHospital_End}</w:t>
+      </w:r>
+    </w:p>
+    <w:p>
+      <w:pPr>
+        <w:ind w:firstLine="0"/>
+        <w:rPr>
+          <w:lang w:val="uk-UA"/>
+        </w:rPr>
+      </w:pPr>
+      <w:r>
+        <w:rPr>
+          <w:lang w:val="uk-UA"/>
+        </w:rPr>
+        <w:t>{\block:MoveFromVacationForCuringToVlk_Begin}</w:t>
+      </w:r>
+    </w:p>
+    <w:p/>
     <w:p>
       <w:pPr>
         <w:rPr>
@@ -2750,11 +3264,33 @@
     </w:p>
     <w:p>
       <w:pPr>
-        <w:rPr>
-          <w:lang w:val="uk-UA"/>
-        </w:rPr>
-      </w:pPr>
-    </w:p>
+        <w:ind w:firstLine="0"/>
+        <w:rPr>
+          <w:lang w:val="uk-UA"/>
+        </w:rPr>
+      </w:pPr>
+      <w:r>
+        <w:rPr>
+          <w:lang w:val="uk-UA"/>
+        </w:rPr>
+        <w:t>{\block:MoveFromVacationForCuringToVlk_End}</w:t>
+      </w:r>
+    </w:p>
+    <w:p>
+      <w:pPr>
+        <w:ind w:firstLine="0"/>
+        <w:rPr>
+          <w:lang w:val="uk-UA"/>
+        </w:rPr>
+      </w:pPr>
+      <w:r>
+        <w:rPr>
+          <w:lang w:val="uk-UA"/>
+        </w:rPr>
+        <w:t>{\block:MoveFromVlkToVacationForCuring_Begin}</w:t>
+      </w:r>
+    </w:p>
+    <w:p/>
     <w:p>
       <w:pPr>
         <w:rPr>
@@ -2783,11 +3319,33 @@
     </w:p>
     <w:p>
       <w:pPr>
-        <w:rPr>
-          <w:lang w:val="uk-UA"/>
-        </w:rPr>
-      </w:pPr>
-    </w:p>
+        <w:ind w:firstLine="0"/>
+        <w:rPr>
+          <w:lang w:val="uk-UA"/>
+        </w:rPr>
+      </w:pPr>
+      <w:r>
+        <w:rPr>
+          <w:lang w:val="uk-UA"/>
+        </w:rPr>
+        <w:t>{\block:MoveFromVlkToVacationForCuring_End}</w:t>
+      </w:r>
+    </w:p>
+    <w:p>
+      <w:pPr>
+        <w:ind w:firstLine="0"/>
+        <w:rPr>
+          <w:lang w:val="uk-UA"/>
+        </w:rPr>
+      </w:pPr>
+      <w:r>
+        <w:rPr>
+          <w:lang w:val="uk-UA"/>
+        </w:rPr>
+        <w:t>{\block:MoveFromVlkToHospital_Begin}</w:t>
+      </w:r>
+    </w:p>
+    <w:p/>
     <w:p>
       <w:pPr>
         <w:rPr>
@@ -2816,11 +3374,33 @@
     </w:p>
     <w:p>
       <w:pPr>
-        <w:rPr>
-          <w:lang w:val="uk-UA"/>
-        </w:rPr>
-      </w:pPr>
-    </w:p>
+        <w:ind w:firstLine="0"/>
+        <w:rPr>
+          <w:lang w:val="uk-UA"/>
+        </w:rPr>
+      </w:pPr>
+      <w:r>
+        <w:rPr>
+          <w:lang w:val="uk-UA"/>
+        </w:rPr>
+        <w:t>{\block:MoveFromVlkToHospital_End}</w:t>
+      </w:r>
+    </w:p>
+    <w:p>
+      <w:pPr>
+        <w:ind w:firstLine="0"/>
+        <w:rPr>
+          <w:lang w:val="uk-UA"/>
+        </w:rPr>
+      </w:pPr>
+      <w:r>
+        <w:rPr>
+          <w:lang w:val="uk-UA"/>
+        </w:rPr>
+        <w:t>{\block:MoveFromAnnualVacationToFamilyVacation_Begin}</w:t>
+      </w:r>
+    </w:p>
+    <w:p/>
     <w:p>
       <w:pPr>
         <w:rPr>
@@ -2873,11 +3453,33 @@
     </w:p>
     <w:p>
       <w:pPr>
-        <w:rPr>
-          <w:lang w:val="uk-UA"/>
-        </w:rPr>
-      </w:pPr>
-    </w:p>
+        <w:ind w:firstLine="0"/>
+        <w:rPr>
+          <w:lang w:val="uk-UA"/>
+        </w:rPr>
+      </w:pPr>
+      <w:r>
+        <w:rPr>
+          <w:lang w:val="uk-UA"/>
+        </w:rPr>
+        <w:t>{\block:MoveFromAnnualVacationToFamilyVacation_End}</w:t>
+      </w:r>
+    </w:p>
+    <w:p>
+      <w:pPr>
+        <w:ind w:firstLine="0"/>
+        <w:rPr>
+          <w:lang w:val="uk-UA"/>
+        </w:rPr>
+      </w:pPr>
+      <w:r>
+        <w:rPr>
+          <w:lang w:val="uk-UA"/>
+        </w:rPr>
+        <w:t>{\block:MoveFromFamilyVacationToAnnualVacation_Begin}</w:t>
+      </w:r>
+    </w:p>
+    <w:p/>
     <w:p>
       <w:pPr>
         <w:rPr>
@@ -2936,21 +3538,44 @@
     </w:p>
     <w:p>
       <w:pPr>
-        <w:rPr>
-          <w:lang w:val="uk-UA"/>
-        </w:rPr>
-      </w:pPr>
-    </w:p>
-    <w:p>
-      <w:pPr>
-        <w:rPr>
-          <w:lang w:val="uk-UA"/>
-        </w:rPr>
-      </w:pPr>
-      <w:r>
-        <w:rPr>
-          <w:lang w:val="uk-UA"/>
-        </w:rPr>
+        <w:ind w:firstLine="0"/>
+        <w:rPr>
+          <w:lang w:val="uk-UA"/>
+        </w:rPr>
+      </w:pPr>
+      <w:r>
+        <w:rPr>
+          <w:lang w:val="uk-UA"/>
+        </w:rPr>
+        <w:t>{\block:MoveFromFamilyVacationToAnnualVacation_End}</w:t>
+      </w:r>
+    </w:p>
+    <w:p>
+      <w:pPr>
+        <w:ind w:firstLine="0"/>
+        <w:rPr>
+          <w:lang w:val="uk-UA"/>
+        </w:rPr>
+      </w:pPr>
+      <w:r>
+        <w:rPr>
+          <w:lang w:val="uk-UA"/>
+        </w:rPr>
+        <w:t>{\block:MoveFromHospitalToExternalVlk_Begin}</w:t>
+      </w:r>
+    </w:p>
+    <w:p/>
+    <w:p>
+      <w:pPr>
+        <w:rPr>
+          <w:lang w:val="uk-UA"/>
+        </w:rPr>
+      </w:pPr>
+      <w:r>
+        <w:rPr>
+          <w:lang w:val="uk-UA"/>
+        </w:rPr>
+        <w:lastRenderedPageBreak/>
         <w:t>{\export:MoveFromHospitalTo</w:t>
       </w:r>
       <w:r>
@@ -2993,11 +3618,33 @@
     </w:p>
     <w:p>
       <w:pPr>
-        <w:rPr>
-          <w:lang w:val="uk-UA"/>
-        </w:rPr>
-      </w:pPr>
-    </w:p>
+        <w:ind w:firstLine="0"/>
+        <w:rPr>
+          <w:lang w:val="uk-UA"/>
+        </w:rPr>
+      </w:pPr>
+      <w:r>
+        <w:rPr>
+          <w:lang w:val="uk-UA"/>
+        </w:rPr>
+        <w:t>{\block:MoveFromHospitalToExternalVlk_End}</w:t>
+      </w:r>
+    </w:p>
+    <w:p>
+      <w:pPr>
+        <w:ind w:firstLine="0"/>
+        <w:rPr>
+          <w:lang w:val="uk-UA"/>
+        </w:rPr>
+      </w:pPr>
+      <w:r>
+        <w:rPr>
+          <w:lang w:val="uk-UA"/>
+        </w:rPr>
+        <w:t>{\block:MoveFromFamilyVacationToHospital_Begin}</w:t>
+      </w:r>
+    </w:p>
+    <w:p/>
     <w:p>
       <w:pPr>
         <w:rPr>
@@ -3024,6 +3671,34 @@
         <w:t>{\export:MoveFromFamilyVacationToHospital_End}</w:t>
       </w:r>
     </w:p>
+    <w:p>
+      <w:pPr>
+        <w:ind w:firstLine="0"/>
+        <w:rPr>
+          <w:lang w:val="uk-UA"/>
+        </w:rPr>
+      </w:pPr>
+      <w:r>
+        <w:rPr>
+          <w:lang w:val="uk-UA"/>
+        </w:rPr>
+        <w:t>{\block:MoveFromFamilyVacationToHospital_End}</w:t>
+      </w:r>
+    </w:p>
+    <w:p>
+      <w:pPr>
+        <w:ind w:firstLine="0"/>
+        <w:rPr>
+          <w:lang w:val="uk-UA"/>
+        </w:rPr>
+      </w:pPr>
+      <w:r>
+        <w:rPr>
+          <w:lang w:val="uk-UA"/>
+        </w:rPr>
+        <w:t>{\block:MoveFromExternalVlkToVacationForCuring_Begin}</w:t>
+      </w:r>
+    </w:p>
     <w:p/>
     <w:p>
       <w:pPr>
@@ -3107,11 +3782,33 @@
     </w:p>
     <w:p>
       <w:pPr>
-        <w:rPr>
-          <w:lang w:val="uk-UA"/>
-        </w:rPr>
-      </w:pPr>
-    </w:p>
+        <w:ind w:firstLine="0"/>
+        <w:rPr>
+          <w:lang w:val="uk-UA"/>
+        </w:rPr>
+      </w:pPr>
+      <w:r>
+        <w:rPr>
+          <w:lang w:val="uk-UA"/>
+        </w:rPr>
+        <w:t>{\block:MoveFromExternalVlkToVacationForCuring_End}</w:t>
+      </w:r>
+    </w:p>
+    <w:p>
+      <w:pPr>
+        <w:ind w:firstLine="0"/>
+        <w:rPr>
+          <w:lang w:val="uk-UA"/>
+        </w:rPr>
+      </w:pPr>
+      <w:r>
+        <w:rPr>
+          <w:lang w:val="uk-UA"/>
+        </w:rPr>
+        <w:t>{\block:MoveFromAnnualVacationToVlk_Begin}</w:t>
+      </w:r>
+    </w:p>
+    <w:p/>
     <w:p>
       <w:pPr>
         <w:rPr>
@@ -3146,11 +3843,33 @@
     </w:p>
     <w:p>
       <w:pPr>
-        <w:rPr>
-          <w:lang w:val="uk-UA"/>
-        </w:rPr>
-      </w:pPr>
-    </w:p>
+        <w:ind w:firstLine="0"/>
+        <w:rPr>
+          <w:lang w:val="uk-UA"/>
+        </w:rPr>
+      </w:pPr>
+      <w:r>
+        <w:rPr>
+          <w:lang w:val="uk-UA"/>
+        </w:rPr>
+        <w:t>{\block:MoveFromAnnualVacationToVlk_End}</w:t>
+      </w:r>
+    </w:p>
+    <w:p>
+      <w:pPr>
+        <w:ind w:firstLine="0"/>
+        <w:rPr>
+          <w:lang w:val="uk-UA"/>
+        </w:rPr>
+      </w:pPr>
+      <w:r>
+        <w:rPr>
+          <w:lang w:val="uk-UA"/>
+        </w:rPr>
+        <w:t>{\block:MoveFromFamilyVacationToVlk_Begin}</w:t>
+      </w:r>
+    </w:p>
+    <w:p/>
     <w:p>
       <w:pPr>
         <w:rPr>
@@ -3177,6 +3896,34 @@
         <w:t>{\export:MoveFromFamilyVacationToVlk_End}</w:t>
       </w:r>
     </w:p>
+    <w:p>
+      <w:pPr>
+        <w:ind w:firstLine="0"/>
+        <w:rPr>
+          <w:lang w:val="uk-UA"/>
+        </w:rPr>
+      </w:pPr>
+      <w:r>
+        <w:rPr>
+          <w:lang w:val="uk-UA"/>
+        </w:rPr>
+        <w:t>{\block:MoveFromFamilyVacationToVlk_End}</w:t>
+      </w:r>
+    </w:p>
+    <w:p>
+      <w:pPr>
+        <w:ind w:firstLine="0"/>
+        <w:rPr>
+          <w:lang w:val="uk-UA"/>
+        </w:rPr>
+      </w:pPr>
+      <w:r>
+        <w:rPr>
+          <w:lang w:val="uk-UA"/>
+        </w:rPr>
+        <w:t>{\block:MoveFromExternalVlkToHospital_Begin}</w:t>
+      </w:r>
+    </w:p>
     <w:p/>
     <w:p>
       <w:pPr>
@@ -3230,171 +3977,18 @@
     </w:p>
     <w:p>
       <w:pPr>
-        <w:rPr>
-          <w:lang w:val="uk-UA"/>
-        </w:rPr>
-      </w:pPr>
-    </w:p>
-    <w:p>
-      <w:pPr>
-        <w:pStyle w:val="ListParagraph"/>
-        <w:ind w:left="0"/>
-        <w:rPr>
-          <w:b/>
-          <w:bCs/>
-          <w:color w:val="595959" w:themeColor="text1" w:themeTint="A6"/>
-          <w:szCs w:val="28"/>
-          <w:lang w:val="uk-UA"/>
-        </w:rPr>
-      </w:pPr>
-      <w:r>
-        <w:rPr>
-          <w:b/>
-          <w:bCs/>
-          <w:color w:val="595959" w:themeColor="text1" w:themeTint="A6"/>
-          <w:szCs w:val="28"/>
-          <w:lang w:val="uk-UA"/>
-        </w:rPr>
-        <w:t>ДОДАТКОВО</w:t>
-      </w:r>
-    </w:p>
-    <w:p>
-      <w:pPr>
-        <w:pStyle w:val="ListParagraph"/>
-        <w:ind w:left="0"/>
-        <w:rPr>
-          <w:b/>
-          <w:bCs/>
-          <w:color w:val="595959" w:themeColor="text1" w:themeTint="A6"/>
-          <w:szCs w:val="28"/>
-          <w:lang w:val="uk-UA"/>
-        </w:rPr>
-      </w:pPr>
-      <w:r>
-        <w:rPr>
-          <w:b/>
-          <w:bCs/>
-          <w:color w:val="595959" w:themeColor="text1" w:themeTint="A6"/>
-          <w:szCs w:val="28"/>
-          <w:lang w:val="uk-UA"/>
-        </w:rPr>
-        <w:t>ПРИБУТТЯ</w:t>
-      </w:r>
-    </w:p>
-    <w:p>
-      <w:pPr>
-        <w:pStyle w:val="ListParagraph"/>
-        <w:ind w:left="0"/>
-        <w:rPr>
-          <w:b/>
-          <w:bCs/>
-          <w:color w:val="595959" w:themeColor="text1" w:themeTint="A6"/>
-          <w:szCs w:val="28"/>
-          <w:lang w:val="uk-UA"/>
-        </w:rPr>
-      </w:pPr>
-      <w:r>
-        <w:rPr>
-          <w:b/>
-          <w:bCs/>
-          <w:color w:val="595959" w:themeColor="text1" w:themeTint="A6"/>
-          <w:szCs w:val="28"/>
-          <w:lang w:val="uk-UA"/>
-        </w:rPr>
-        <w:t xml:space="preserve">ВИКЛЮЧЕННЯ ЗІ СПИСКІВ ОСОБОВОГО СКЛАДУ </w:t>
-      </w:r>
-    </w:p>
-    <w:p>
-      <w:pPr>
-        <w:pStyle w:val="ListParagraph"/>
-        <w:ind w:left="0"/>
-        <w:rPr>
-          <w:b/>
-          <w:bCs/>
-          <w:color w:val="595959" w:themeColor="text1" w:themeTint="A6"/>
-          <w:szCs w:val="28"/>
-          <w:lang w:val="uk-UA"/>
-        </w:rPr>
-      </w:pPr>
-      <w:r>
-        <w:rPr>
-          <w:b/>
-          <w:bCs/>
-          <w:color w:val="595959" w:themeColor="text1" w:themeTint="A6"/>
-          <w:szCs w:val="28"/>
-          <w:lang w:val="uk-UA"/>
-        </w:rPr>
-        <w:t>ТИХ, ЩО ЗВІЛЬНЯЮТЬСЯ З В/СЛУЖБИ</w:t>
-      </w:r>
-    </w:p>
-    <w:p>
-      <w:pPr>
-        <w:pStyle w:val="ListParagraph"/>
-        <w:ind w:left="0"/>
-        <w:rPr>
-          <w:b/>
-          <w:bCs/>
-          <w:color w:val="595959" w:themeColor="text1" w:themeTint="A6"/>
-          <w:szCs w:val="28"/>
-          <w:lang w:val="uk-UA"/>
-        </w:rPr>
-      </w:pPr>
-      <w:r>
-        <w:rPr>
-          <w:b/>
-          <w:bCs/>
-          <w:color w:val="595959" w:themeColor="text1" w:themeTint="A6"/>
-          <w:szCs w:val="28"/>
-          <w:lang w:val="uk-UA"/>
-        </w:rPr>
-        <w:t>ЗАГИБЛИХ (ПОМЕРЛИХ)</w:t>
-      </w:r>
-    </w:p>
-    <w:p>
-      <w:pPr>
-        <w:pStyle w:val="ListParagraph"/>
-        <w:ind w:left="0"/>
-        <w:rPr>
-          <w:b/>
-          <w:bCs/>
-          <w:color w:val="595959" w:themeColor="text1" w:themeTint="A6"/>
-          <w:lang w:val="uk-UA"/>
-        </w:rPr>
-      </w:pPr>
-      <w:r>
-        <w:rPr>
-          <w:b/>
-          <w:bCs/>
-          <w:color w:val="595959" w:themeColor="text1" w:themeTint="A6"/>
-          <w:lang w:val="uk-UA"/>
-        </w:rPr>
-        <w:t xml:space="preserve">ДИСТАНЦІЙНО (НАПРИКЛАД, ТИХ, ХТО У ВІДРЯДЖЕННІ) </w:t>
-      </w:r>
-    </w:p>
-    <w:p>
-      <w:pPr>
-        <w:pStyle w:val="ListParagraph"/>
-        <w:ind w:left="0"/>
-        <w:rPr>
-          <w:b/>
-          <w:bCs/>
-          <w:color w:val="595959" w:themeColor="text1" w:themeTint="A6"/>
-          <w:szCs w:val="28"/>
-          <w:lang w:val="uk-UA"/>
-        </w:rPr>
-      </w:pPr>
-      <w:r>
-        <w:rPr>
-          <w:b/>
-          <w:bCs/>
-          <w:color w:val="595959" w:themeColor="text1" w:themeTint="A6"/>
-          <w:szCs w:val="28"/>
-          <w:lang w:val="uk-UA"/>
-        </w:rPr>
-        <w:t>ЕЛЕМЕНТИ (ЗАГАЛЬНІ)</w:t>
-      </w:r>
-    </w:p>
-    <w:p/>
+        <w:ind w:firstLine="0"/>
+        <w:rPr>
+          <w:lang w:val="uk-UA"/>
+        </w:rPr>
+      </w:pPr>
+      <w:r>
+        <w:rPr>
+          <w:lang w:val="uk-UA"/>
+        </w:rPr>
+        <w:t>{\block:MoveFromExternalVlkToHospital_End}</w:t>
+      </w:r>
+    </w:p>
     <w:sectPr>
       <w:headerReference w:type="default" r:id="rId8"/>
       <w:pgSz w:w="11906" w:h="16838" w:code="9"/>

</xml_diff>

<commit_message>
Add Movement export diff and medical company leave mode
</commit_message>
<xml_diff>
--- a/PROJECTS_EXCEL/workbook/PersonalEventBuilder/{yyyy}-{mm}-{dd} №{OrderNum} ({Signatory}) (Александр).docx
+++ b/PROJECTS_EXCEL/workbook/PersonalEventBuilder/{yyyy}-{mm}-{dd} №{OrderNum} ({Signatory}) (Александр).docx
@@ -254,6 +254,7 @@
         </w:rPr>
         <w:t>{</w:t>
       </w:r>
+      <w:proofErr w:type="gramStart"/>
       <w:r>
         <w:rPr>
           <w:szCs w:val="28"/>
@@ -281,6 +282,7 @@
         </w:rPr>
         <w:t>{</w:t>
       </w:r>
+      <w:proofErr w:type="gramEnd"/>
       <w:r>
         <w:rPr>
           <w:szCs w:val="28"/>
@@ -1311,7 +1313,23 @@
           <w:color w:val="000000"/>
           <w:szCs w:val="28"/>
         </w:rPr>
-        <w:t>{\block:FromExternalVlk_Begin}</w:t>
+        <w:t>{\</w:t>
+      </w:r>
+      <w:proofErr w:type="gramStart"/>
+      <w:r>
+        <w:rPr>
+          <w:color w:val="000000"/>
+          <w:szCs w:val="28"/>
+        </w:rPr>
+        <w:t>block:FromExternalVlk</w:t>
+      </w:r>
+      <w:proofErr w:type="gramEnd"/>
+      <w:r>
+        <w:rPr>
+          <w:color w:val="000000"/>
+          <w:szCs w:val="28"/>
+        </w:rPr>
+        <w:t>_Begin}</w:t>
       </w:r>
     </w:p>
     <w:p/>
@@ -1382,7 +1400,14 @@
         <w:rPr>
           <w:szCs w:val="28"/>
         </w:rPr>
-        <w:t>\export:</w:t>
+        <w:t>\</w:t>
+      </w:r>
+      <w:proofErr w:type="gramStart"/>
+      <w:r>
+        <w:rPr>
+          <w:szCs w:val="28"/>
+        </w:rPr>
+        <w:t>export:</w:t>
       </w:r>
       <w:r>
         <w:rPr>
@@ -1405,6 +1430,7 @@
         </w:rPr>
         <w:t>Vlk</w:t>
       </w:r>
+      <w:proofErr w:type="gramEnd"/>
       <w:r>
         <w:rPr>
           <w:szCs w:val="28"/>
@@ -1438,7 +1464,14 @@
         <w:rPr>
           <w:szCs w:val="28"/>
         </w:rPr>
-        <w:t>\export:</w:t>
+        <w:t>\</w:t>
+      </w:r>
+      <w:proofErr w:type="gramStart"/>
+      <w:r>
+        <w:rPr>
+          <w:szCs w:val="28"/>
+        </w:rPr>
+        <w:t>export:</w:t>
       </w:r>
       <w:r>
         <w:rPr>
@@ -1461,6 +1494,7 @@
         </w:rPr>
         <w:t>Vlk</w:t>
       </w:r>
+      <w:proofErr w:type="gramEnd"/>
       <w:r>
         <w:rPr>
           <w:szCs w:val="28"/>
@@ -1489,21 +1523,23 @@
           <w:color w:val="000000"/>
           <w:szCs w:val="28"/>
         </w:rPr>
-        <w:t>{\block:FromExternalVlk_End}</w:t>
-      </w:r>
-    </w:p>
-    <w:p>
-      <w:pPr>
-        <w:ind w:firstLine="0"/>
-        <w:rPr>
-          <w:lang w:val="uk-UA"/>
-        </w:rPr>
-      </w:pPr>
-      <w:r>
-        <w:rPr>
-          <w:lang w:val="uk-UA"/>
-        </w:rPr>
-        <w:t>{\block:FromMedicalCompanyForTreatment_Begin}</w:t>
+        <w:t>{\</w:t>
+      </w:r>
+      <w:proofErr w:type="gramStart"/>
+      <w:r>
+        <w:rPr>
+          <w:color w:val="000000"/>
+          <w:szCs w:val="28"/>
+        </w:rPr>
+        <w:t>block:FromExternalVlk</w:t>
+      </w:r>
+      <w:proofErr w:type="gramEnd"/>
+      <w:r>
+        <w:rPr>
+          <w:color w:val="000000"/>
+          <w:szCs w:val="28"/>
+        </w:rPr>
+        <w:t>_End}</w:t>
       </w:r>
     </w:p>
     <w:p/>
@@ -1557,6 +1593,48 @@
     </w:p>
     <w:p>
       <w:pPr>
+        <w:ind w:firstLine="0"/>
+        <w:rPr>
+          <w:lang w:val="uk-UA"/>
+        </w:rPr>
+      </w:pPr>
+      <w:r>
+        <w:rPr>
+          <w:lang w:val="uk-UA"/>
+        </w:rPr>
+        <w:t>{\block:FromMedicalCompanyForTreatment_Begin}</w:t>
+      </w:r>
+    </w:p>
+    <w:p/>
+    <w:p>
+      <w:pPr>
+        <w:pStyle w:val="ListParagraph"/>
+        <w:numPr>
+          <w:ilvl w:val="1"/>
+          <w:numId w:val="1"/>
+        </w:numPr>
+        <w:rPr>
+          <w:highlight w:val="yellow"/>
+          <w:lang w:val="uk-UA"/>
+        </w:rPr>
+      </w:pPr>
+      <w:r>
+        <w:rPr>
+          <w:highlight w:val="yellow"/>
+          <w:lang w:val="uk-UA"/>
+        </w:rPr>
+        <w:t>З медичної роти військової частини А7383:</w:t>
+      </w:r>
+      <w:r>
+        <w:rPr>
+          <w:highlight w:val="yellow"/>
+          <w:lang w:val="uk-UA"/>
+        </w:rPr>
+        <w:t/>
+      </w:r>
+    </w:p>
+    <w:p>
+      <w:pPr>
         <w:rPr>
           <w:lang w:val="uk-UA"/>
         </w:rPr>
@@ -2344,20 +2422,6 @@
         <w:t>{\block:ToMaternityLeave_End}</w:t>
       </w:r>
     </w:p>
-    <w:p>
-      <w:pPr>
-        <w:ind w:firstLine="0"/>
-        <w:rPr>
-          <w:lang w:val="uk-UA"/>
-        </w:rPr>
-      </w:pPr>
-      <w:r>
-        <w:rPr>
-          <w:lang w:val="uk-UA"/>
-        </w:rPr>
-        <w:t>{\block:ToMedicalCompanyForTreatment_Begin}</w:t>
-      </w:r>
-    </w:p>
     <w:p/>
     <w:p>
       <w:pPr>
@@ -2392,21 +2456,64 @@
     </w:p>
     <w:p>
       <w:pPr>
-        <w:rPr>
-          <w:lang w:val="uk-UA"/>
-        </w:rPr>
-      </w:pPr>
-    </w:p>
-    <w:p>
-      <w:pPr>
-        <w:rPr>
-          <w:lang w:val="uk-UA"/>
-        </w:rPr>
-      </w:pPr>
-      <w:r>
-        <w:rPr>
-          <w:lang w:val="uk-UA"/>
-        </w:rPr>
+        <w:ind w:firstLine="0"/>
+        <w:rPr>
+          <w:lang w:val="uk-UA"/>
+        </w:rPr>
+      </w:pPr>
+      <w:r>
+        <w:rPr>
+          <w:lang w:val="uk-UA"/>
+        </w:rPr>
+        <w:t>{\block:ToMedicalCompanyForTreatment_Begin}</w:t>
+      </w:r>
+    </w:p>
+    <w:p/>
+    <w:p>
+      <w:pPr>
+        <w:pStyle w:val="ListParagraph"/>
+        <w:numPr>
+          <w:ilvl w:val="1"/>
+          <w:numId w:val="1"/>
+        </w:numPr>
+        <w:rPr>
+          <w:highlight w:val="yellow"/>
+          <w:lang w:val="uk-UA"/>
+        </w:rPr>
+      </w:pPr>
+      <w:r>
+        <w:rPr>
+          <w:highlight w:val="yellow"/>
+          <w:lang w:val="uk-UA"/>
+        </w:rPr>
+        <w:t>На лікування до медичної роти військової частини А7383:</w:t>
+      </w:r>
+      <w:r>
+        <w:rPr>
+          <w:highlight w:val="yellow"/>
+          <w:lang w:val="uk-UA"/>
+        </w:rPr>
+        <w:t/>
+      </w:r>
+    </w:p>
+    <w:p>
+      <w:pPr>
+        <w:rPr>
+          <w:lang w:val="uk-UA"/>
+        </w:rPr>
+      </w:pPr>
+    </w:p>
+    <w:p>
+      <w:pPr>
+        <w:rPr>
+          <w:lang w:val="uk-UA"/>
+        </w:rPr>
+      </w:pPr>
+      <w:r>
+        <w:rPr>
+          <w:lang w:val="uk-UA"/>
+        </w:rPr>
+        <w:lastRenderedPageBreak/>
         <w:t>{\export:</w:t>
       </w:r>
       <w:r>
@@ -2469,46 +2576,84 @@
     </w:p>
     <w:p>
       <w:pPr>
+        <w:ind w:firstLine="0"/>
+        <w:rPr>
+          <w:lang w:val="uk-UA"/>
+        </w:rPr>
+      </w:pPr>
+      <w:r>
+        <w:rPr>
+          <w:lang w:val="uk-UA"/>
+        </w:rPr>
+        <w:t>{\block:ToMedicalCompanyVacationForCuring_Begin}</w:t>
+      </w:r>
+    </w:p>
+    <w:p/>
+    <w:p>
+      <w:pPr>
         <w:pStyle w:val="ListParagraph"/>
-        <w:spacing w:line="247" w:lineRule="auto"/>
-        <w:ind w:left="709" w:firstLine="0"/>
-        <w:rPr>
-          <w:b/>
-          <w:bCs/>
-          <w:color w:val="595959" w:themeColor="text1" w:themeTint="A6"/>
-          <w:lang w:val="uk-UA"/>
-        </w:rPr>
-      </w:pPr>
-      <w:r>
-        <w:rPr>
-          <w:b/>
-          <w:bCs/>
-          <w:color w:val="595959" w:themeColor="text1" w:themeTint="A6"/>
-          <w:lang w:val="uk-UA"/>
-        </w:rPr>
-        <w:t>СЗЧ</w:t>
-      </w:r>
-    </w:p>
-    <w:p>
-      <w:pPr>
-        <w:pStyle w:val="ListParagraph"/>
-        <w:spacing w:line="247" w:lineRule="auto"/>
-        <w:ind w:left="709" w:firstLine="0"/>
-        <w:rPr>
-          <w:b/>
-          <w:bCs/>
-          <w:color w:val="595959" w:themeColor="text1" w:themeTint="A6"/>
-          <w:lang w:val="uk-UA"/>
-        </w:rPr>
-      </w:pPr>
-      <w:r>
-        <w:rPr>
-          <w:b/>
-          <w:bCs/>
-          <w:color w:val="595959" w:themeColor="text1" w:themeTint="A6"/>
-          <w:lang w:val="uk-UA"/>
-        </w:rPr>
-        <w:t>ПОСАДИ</w:t>
+        <w:numPr>
+          <w:ilvl w:val="1"/>
+          <w:numId w:val="1"/>
+        </w:numPr>
+        <w:rPr>
+          <w:highlight w:val="yellow"/>
+          <w:lang w:val="uk-UA"/>
+        </w:rPr>
+      </w:pPr>
+      <w:r>
+        <w:rPr>
+          <w:highlight w:val="yellow"/>
+          <w:lang w:val="uk-UA"/>
+        </w:rPr>
+        <w:t>У відпустку для лікування у медичній роті військової частини А7383:</w:t>
+      </w:r>
+    </w:p>
+    <w:p>
+      <w:pPr>
+        <w:rPr>
+          <w:lang w:val="uk-UA"/>
+        </w:rPr>
+      </w:pPr>
+    </w:p>
+    <w:p>
+      <w:pPr>
+        <w:rPr>
+          <w:lang w:val="uk-UA"/>
+        </w:rPr>
+      </w:pPr>
+      <w:r>
+        <w:rPr>
+          <w:lang w:val="uk-UA"/>
+        </w:rPr>
+        <w:t>{\export:ToMedicalCompanyVacationForCuring_Begin}</w:t>
+      </w:r>
+    </w:p>
+    <w:p>
+      <w:pPr>
+        <w:rPr>
+          <w:lang w:val="uk-UA"/>
+        </w:rPr>
+      </w:pPr>
+      <w:r>
+        <w:rPr>
+          <w:lang w:val="uk-UA"/>
+        </w:rPr>
+        <w:t>{\export:ToMedicalCompanyVacationForCuring_End}</w:t>
+      </w:r>
+    </w:p>
+    <w:p>
+      <w:pPr>
+        <w:ind w:firstLine="0"/>
+        <w:rPr>
+          <w:lang w:val="uk-UA"/>
+        </w:rPr>
+      </w:pPr>
+      <w:r>
+        <w:rPr>
+          <w:lang w:val="uk-UA"/>
+        </w:rPr>
+        <w:t>{\block:ToMedicalCompanyVacationForCuring_End}</w:t>
       </w:r>
     </w:p>
     <w:p>
@@ -2549,7 +2694,6 @@
         <w:rPr>
           <w:lang w:val="uk-UA"/>
         </w:rPr>
-        <w:lastRenderedPageBreak/>
         <w:t>{\export:MoveFromHospitalToVacationForCuring_End}</w:t>
       </w:r>
     </w:p>
@@ -2977,7 +3121,6 @@
         <w:rPr>
           <w:lang w:val="uk-UA"/>
         </w:rPr>
-        <w:lastRenderedPageBreak/>
         <w:t>{\export:MoveFromVacationForCuringToVacationForCuring_Begin}</w:t>
       </w:r>
     </w:p>
@@ -3575,7 +3718,6 @@
         <w:rPr>
           <w:lang w:val="uk-UA"/>
         </w:rPr>
-        <w:lastRenderedPageBreak/>
         <w:t>{\export:MoveFromHospitalTo</w:t>
       </w:r>
       <w:r>

</xml_diff>

<commit_message>
Remove empty Word root sections and preserve independent status transitions
</commit_message>
<xml_diff>
--- a/PROJECTS_EXCEL/workbook/PersonalEventBuilder/{yyyy}-{mm}-{dd} №{OrderNum} ({Signatory}) (Александр).docx
+++ b/PROJECTS_EXCEL/workbook/PersonalEventBuilder/{yyyy}-{mm}-{dd} №{OrderNum} ({Signatory}) (Александр).docx
@@ -22,7 +22,7 @@
           <w:lang w:val="uk-UA"/>
         </w:rPr>
         <w:drawing>
-          <wp:anchor distT="0" distB="0" distL="114300" distR="114300" simplePos="0" relativeHeight="251659264" behindDoc="0" locked="0" layoutInCell="1" allowOverlap="1" wp14:anchorId="7B6EA6B4" wp14:editId="5EFE49FD">
+          <wp:anchor distT="0" distB="0" distL="114300" distR="114300" simplePos="0" relativeHeight="251659264" behindDoc="0" locked="0" layoutInCell="1" allowOverlap="1" wp14:anchorId="1500F928" wp14:editId="6163273B">
             <wp:simplePos x="0" y="0"/>
             <wp:positionH relativeFrom="margin">
               <wp:align>center</wp:align>
@@ -364,6 +364,20 @@
     </w:p>
     <w:p>
       <w:pPr>
+        <w:ind w:firstLine="0"/>
+        <w:rPr>
+          <w:lang w:val="uk-UA"/>
+        </w:rPr>
+      </w:pPr>
+      <w:r>
+        <w:rPr>
+          <w:lang w:val="uk-UA"/>
+        </w:rPr>
+        <w:t>{\root:OrderSection1_Begin}</w:t>
+      </w:r>
+    </w:p>
+    <w:p>
+      <w:pPr>
         <w:pStyle w:val="ListParagraph"/>
         <w:numPr>
           <w:ilvl w:val="0"/>
@@ -371,29 +385,17 @@
         </w:numPr>
         <w:rPr>
           <w:szCs w:val="28"/>
-          <w:lang w:val="uk-UA"/>
-        </w:rPr>
-      </w:pPr>
-      <w:r>
-        <w:rPr>
-          <w:szCs w:val="28"/>
-          <w:lang w:val="uk-UA"/>
-        </w:rPr>
-        <w:t xml:space="preserve">Вважати такими, що </w:t>
-      </w:r>
-      <w:r>
-        <w:rPr>
-          <w:szCs w:val="28"/>
-          <w:lang w:val="uk-UA"/>
-        </w:rPr>
-        <w:t>прибу</w:t>
-      </w:r>
-      <w:r>
-        <w:rPr>
-          <w:szCs w:val="28"/>
-          <w:lang w:val="uk-UA"/>
-        </w:rPr>
-        <w:t>ли:</w:t>
+          <w:highlight w:val="yellow"/>
+          <w:lang w:val="uk-UA"/>
+        </w:rPr>
+      </w:pPr>
+      <w:r>
+        <w:rPr>
+          <w:szCs w:val="28"/>
+          <w:highlight w:val="yellow"/>
+          <w:lang w:val="uk-UA"/>
+        </w:rPr>
+        <w:t>Вважати такими, що прибули:</w:t>
       </w:r>
     </w:p>
     <w:p>
@@ -402,6 +404,7 @@
         <w:ind w:left="0"/>
         <w:rPr>
           <w:szCs w:val="28"/>
+          <w:highlight w:val="yellow"/>
           <w:lang w:val="uk-UA"/>
         </w:rPr>
       </w:pPr>
@@ -418,41 +421,15 @@
       <w:r>
         <w:rPr>
           <w:szCs w:val="28"/>
-          <w:lang w:val="uk-UA"/>
-        </w:rPr>
-        <w:t xml:space="preserve">для подальшого проходження військової служби, </w:t>
-      </w:r>
-      <w:r>
-        <w:rPr>
-          <w:szCs w:val="28"/>
-          <w:lang w:val="uk-UA"/>
-        </w:rPr>
-        <w:t>зарах</w:t>
-      </w:r>
-      <w:r>
-        <w:rPr>
-          <w:szCs w:val="28"/>
-          <w:lang w:val="uk-UA"/>
-        </w:rPr>
-        <w:t xml:space="preserve">увати до тимчасово </w:t>
-      </w:r>
-      <w:r>
-        <w:rPr>
-          <w:szCs w:val="28"/>
-          <w:lang w:val="uk-UA"/>
-        </w:rPr>
-        <w:t>прибу</w:t>
-      </w:r>
-      <w:r>
-        <w:rPr>
-          <w:szCs w:val="28"/>
-          <w:lang w:val="uk-UA"/>
-        </w:rPr>
-        <w:t>лого особового складу з</w:t>
-      </w:r>
-      <w:r>
-        <w:rPr>
-          <w:szCs w:val="28"/>
+          <w:highlight w:val="yellow"/>
+          <w:lang w:val="uk-UA"/>
+        </w:rPr>
+        <w:t>для подальшого проходження військової служби, зарахувати до тимчасово прибулого особового складу з</w:t>
+      </w:r>
+      <w:r>
+        <w:rPr>
+          <w:szCs w:val="28"/>
+          <w:highlight w:val="yellow"/>
         </w:rPr>
         <w:t> </w:t>
       </w:r>
@@ -460,6 +437,7 @@
         <w:rPr>
           <w:color w:val="000000" w:themeColor="text1"/>
           <w:szCs w:val="28"/>
+          <w:highlight w:val="yellow"/>
           <w:lang w:val="uk-UA"/>
         </w:rPr>
         <w:t>{</w:t>
@@ -468,6 +446,7 @@
         <w:rPr>
           <w:color w:val="000000" w:themeColor="text1"/>
           <w:szCs w:val="28"/>
+          <w:highlight w:val="yellow"/>
         </w:rPr>
         <w:t>dd</w:t>
       </w:r>
@@ -475,6 +454,7 @@
         <w:rPr>
           <w:color w:val="000000" w:themeColor="text1"/>
           <w:szCs w:val="28"/>
+          <w:highlight w:val="yellow"/>
           <w:lang w:val="uk-UA"/>
         </w:rPr>
         <w:t>}</w:t>
@@ -482,12 +462,14 @@
       <w:r>
         <w:rPr>
           <w:szCs w:val="28"/>
+          <w:highlight w:val="yellow"/>
         </w:rPr>
         <w:t> </w:t>
       </w:r>
       <w:r>
         <w:rPr>
           <w:szCs w:val="28"/>
+          <w:highlight w:val="yellow"/>
           <w:lang w:val="uk-UA"/>
         </w:rPr>
         <w:t>{</w:t>
@@ -495,12 +477,29 @@
       <w:r>
         <w:rPr>
           <w:szCs w:val="28"/>
+          <w:highlight w:val="yellow"/>
         </w:rPr>
         <w:t>month</w:t>
       </w:r>
       <w:r>
         <w:rPr>
           <w:szCs w:val="28"/>
+          <w:highlight w:val="yellow"/>
+          <w:lang w:val="uk-UA"/>
+        </w:rPr>
+        <w:t>} {</w:t>
+      </w:r>
+      <w:r>
+        <w:rPr>
+          <w:szCs w:val="28"/>
+          <w:highlight w:val="yellow"/>
+        </w:rPr>
+        <w:t>yyyy</w:t>
+      </w:r>
+      <w:r>
+        <w:rPr>
+          <w:szCs w:val="28"/>
+          <w:highlight w:val="yellow"/>
           <w:lang w:val="uk-UA"/>
         </w:rPr>
         <w:t>}</w:t>
@@ -508,26 +507,85 @@
       <w:r>
         <w:rPr>
           <w:szCs w:val="28"/>
-          <w:lang w:val="uk-UA"/>
-        </w:rPr>
-        <w:t xml:space="preserve"> </w:t>
-      </w:r>
-      <w:r>
-        <w:rPr>
-          <w:szCs w:val="28"/>
+          <w:highlight w:val="yellow"/>
+        </w:rPr>
+        <w:t> </w:t>
+      </w:r>
+      <w:r>
+        <w:rPr>
+          <w:szCs w:val="28"/>
+          <w:highlight w:val="yellow"/>
+          <w:lang w:val="uk-UA"/>
+        </w:rPr>
+        <w:t>року, на котлове забезпечення з</w:t>
+      </w:r>
+      <w:r>
+        <w:rPr>
+          <w:szCs w:val="28"/>
+          <w:highlight w:val="yellow"/>
+        </w:rPr>
+        <w:t> </w:t>
+      </w:r>
+      <w:r>
+        <w:rPr>
+          <w:color w:val="000000" w:themeColor="text1"/>
+          <w:szCs w:val="28"/>
+          <w:highlight w:val="yellow"/>
           <w:lang w:val="uk-UA"/>
         </w:rPr>
         <w:t>{</w:t>
       </w:r>
       <w:r>
         <w:rPr>
-          <w:szCs w:val="28"/>
+          <w:color w:val="000000" w:themeColor="text1"/>
+          <w:szCs w:val="28"/>
+          <w:highlight w:val="yellow"/>
+        </w:rPr>
+        <w:t>dd</w:t>
+      </w:r>
+      <w:r>
+        <w:rPr>
+          <w:color w:val="000000" w:themeColor="text1"/>
+          <w:szCs w:val="28"/>
+          <w:highlight w:val="yellow"/>
+          <w:lang w:val="uk-UA"/>
+        </w:rPr>
+        <w:t>}</w:t>
+      </w:r>
+      <w:r>
+        <w:rPr>
+          <w:szCs w:val="28"/>
+          <w:highlight w:val="yellow"/>
+          <w:lang w:val="uk-UA"/>
+        </w:rPr>
+        <w:t xml:space="preserve"> {</w:t>
+      </w:r>
+      <w:r>
+        <w:rPr>
+          <w:szCs w:val="28"/>
+          <w:highlight w:val="yellow"/>
+        </w:rPr>
+        <w:t>month</w:t>
+      </w:r>
+      <w:r>
+        <w:rPr>
+          <w:szCs w:val="28"/>
+          <w:highlight w:val="yellow"/>
+          <w:lang w:val="uk-UA"/>
+        </w:rPr>
+        <w:t>} {</w:t>
+      </w:r>
+      <w:r>
+        <w:rPr>
+          <w:szCs w:val="28"/>
+          <w:highlight w:val="yellow"/>
         </w:rPr>
         <w:t>yyyy</w:t>
       </w:r>
       <w:r>
         <w:rPr>
           <w:szCs w:val="28"/>
+          <w:highlight w:val="yellow"/>
           <w:lang w:val="uk-UA"/>
         </w:rPr>
         <w:t>}</w:t>
@@ -535,101 +593,14 @@
       <w:r>
         <w:rPr>
           <w:szCs w:val="28"/>
+          <w:highlight w:val="yellow"/>
         </w:rPr>
         <w:t> </w:t>
       </w:r>
       <w:r>
         <w:rPr>
           <w:szCs w:val="28"/>
-          <w:lang w:val="uk-UA"/>
-        </w:rPr>
-        <w:t>року, на котлове забезпечення з</w:t>
-      </w:r>
-      <w:r>
-        <w:rPr>
-          <w:szCs w:val="28"/>
-        </w:rPr>
-        <w:t> </w:t>
-      </w:r>
-      <w:r>
-        <w:rPr>
-          <w:color w:val="000000" w:themeColor="text1"/>
-          <w:szCs w:val="28"/>
-          <w:lang w:val="uk-UA"/>
-        </w:rPr>
-        <w:t>{</w:t>
-      </w:r>
-      <w:r>
-        <w:rPr>
-          <w:color w:val="000000" w:themeColor="text1"/>
-          <w:szCs w:val="28"/>
-        </w:rPr>
-        <w:t>dd</w:t>
-      </w:r>
-      <w:r>
-        <w:rPr>
-          <w:color w:val="000000" w:themeColor="text1"/>
-          <w:szCs w:val="28"/>
-          <w:lang w:val="uk-UA"/>
-        </w:rPr>
-        <w:t>}</w:t>
-      </w:r>
-      <w:r>
-        <w:rPr>
-          <w:szCs w:val="28"/>
-          <w:lang w:val="uk-UA"/>
-        </w:rPr>
-        <w:t xml:space="preserve"> {</w:t>
-      </w:r>
-      <w:r>
-        <w:rPr>
-          <w:szCs w:val="28"/>
-        </w:rPr>
-        <w:t>month</w:t>
-      </w:r>
-      <w:r>
-        <w:rPr>
-          <w:szCs w:val="28"/>
-          <w:lang w:val="uk-UA"/>
-        </w:rPr>
-        <w:t>}</w:t>
-      </w:r>
-      <w:r>
-        <w:rPr>
-          <w:szCs w:val="28"/>
-          <w:lang w:val="uk-UA"/>
-        </w:rPr>
-        <w:t xml:space="preserve"> </w:t>
-      </w:r>
-      <w:r>
-        <w:rPr>
-          <w:szCs w:val="28"/>
-          <w:lang w:val="uk-UA"/>
-        </w:rPr>
-        <w:t>{</w:t>
-      </w:r>
-      <w:r>
-        <w:rPr>
-          <w:szCs w:val="28"/>
-        </w:rPr>
-        <w:t>yyyy</w:t>
-      </w:r>
-      <w:r>
-        <w:rPr>
-          <w:szCs w:val="28"/>
-          <w:lang w:val="uk-UA"/>
-        </w:rPr>
-        <w:t>}</w:t>
-      </w:r>
-      <w:r>
-        <w:rPr>
-          <w:szCs w:val="28"/>
-        </w:rPr>
-        <w:t> </w:t>
-      </w:r>
-      <w:r>
-        <w:rPr>
-          <w:szCs w:val="28"/>
+          <w:highlight w:val="yellow"/>
           <w:lang w:val="uk-UA"/>
         </w:rPr>
         <w:t>року:</w:t>
@@ -644,6 +615,34 @@
           <w:lang w:val="uk-UA"/>
         </w:rPr>
       </w:pPr>
+    </w:p>
+    <w:p>
+      <w:pPr>
+        <w:ind w:firstLine="0"/>
+        <w:rPr>
+          <w:lang w:val="uk-UA"/>
+        </w:rPr>
+      </w:pPr>
+      <w:r>
+        <w:rPr>
+          <w:lang w:val="uk-UA"/>
+        </w:rPr>
+        <w:t>{\root:OrderSection1_End}</w:t>
+      </w:r>
+    </w:p>
+    <w:p>
+      <w:pPr>
+        <w:ind w:firstLine="0"/>
+        <w:rPr>
+          <w:lang w:val="uk-UA"/>
+        </w:rPr>
+      </w:pPr>
+      <w:r>
+        <w:rPr>
+          <w:lang w:val="uk-UA"/>
+        </w:rPr>
+        <w:t>{\root:OrderSection2_Begin}</w:t>
+      </w:r>
     </w:p>
     <w:p>
       <w:pPr>
@@ -654,29 +653,17 @@
         </w:numPr>
         <w:rPr>
           <w:szCs w:val="28"/>
-          <w:lang w:val="uk-UA"/>
-        </w:rPr>
-      </w:pPr>
-      <w:r>
-        <w:rPr>
-          <w:szCs w:val="28"/>
-          <w:lang w:val="uk-UA"/>
-        </w:rPr>
-        <w:t xml:space="preserve">Вважати такими, що </w:t>
-      </w:r>
-      <w:r>
-        <w:rPr>
-          <w:szCs w:val="28"/>
-          <w:lang w:val="uk-UA"/>
-        </w:rPr>
-        <w:t>прибу</w:t>
-      </w:r>
-      <w:r>
-        <w:rPr>
-          <w:szCs w:val="28"/>
-          <w:lang w:val="uk-UA"/>
-        </w:rPr>
-        <w:t>ли до складу сил і засобів 2 корпусу Національної гвардії України "Хартія":</w:t>
+          <w:highlight w:val="yellow"/>
+          <w:lang w:val="uk-UA"/>
+        </w:rPr>
+      </w:pPr>
+      <w:r>
+        <w:rPr>
+          <w:szCs w:val="28"/>
+          <w:highlight w:val="yellow"/>
+          <w:lang w:val="uk-UA"/>
+        </w:rPr>
+        <w:t>Вважати такими, що прибули до складу сил і засобів 2 корпусу Національної гвардії України "Хартія":</w:t>
       </w:r>
     </w:p>
     <w:p>
@@ -688,6 +675,34 @@
           <w:lang w:val="uk-UA"/>
         </w:rPr>
       </w:pPr>
+    </w:p>
+    <w:p>
+      <w:pPr>
+        <w:ind w:firstLine="0"/>
+        <w:rPr>
+          <w:lang w:val="uk-UA"/>
+        </w:rPr>
+      </w:pPr>
+      <w:r>
+        <w:rPr>
+          <w:lang w:val="uk-UA"/>
+        </w:rPr>
+        <w:t>{\root:OrderSection2_End}</w:t>
+      </w:r>
+    </w:p>
+    <w:p>
+      <w:pPr>
+        <w:ind w:firstLine="0"/>
+        <w:rPr>
+          <w:lang w:val="uk-UA"/>
+        </w:rPr>
+      </w:pPr>
+      <w:r>
+        <w:rPr>
+          <w:lang w:val="uk-UA"/>
+        </w:rPr>
+        <w:t>{\root:OrderSection3_Begin}</w:t>
+      </w:r>
     </w:p>
     <w:p>
       <w:pPr>
@@ -698,138 +713,86 @@
         </w:numPr>
         <w:rPr>
           <w:szCs w:val="28"/>
-          <w:lang w:val="uk-UA"/>
-        </w:rPr>
-      </w:pPr>
-      <w:r>
-        <w:rPr>
-          <w:szCs w:val="28"/>
-          <w:lang w:val="uk-UA"/>
-        </w:rPr>
-        <w:t xml:space="preserve">Вважати такими, що </w:t>
-      </w:r>
-      <w:r>
-        <w:rPr>
-          <w:szCs w:val="28"/>
-          <w:lang w:val="uk-UA"/>
-        </w:rPr>
-        <w:t>прибу</w:t>
-      </w:r>
-      <w:r>
-        <w:rPr>
-          <w:szCs w:val="28"/>
-          <w:lang w:val="uk-UA"/>
-        </w:rPr>
-        <w:t xml:space="preserve">ли до складу сил і засобів 2 корпусу Національної гвардії України "Хартія" та приступили до виконання службових </w:t>
-      </w:r>
-      <w:r>
-        <w:rPr>
-          <w:szCs w:val="28"/>
-          <w:lang w:val="uk-UA"/>
-        </w:rPr>
-        <w:t>обов'язків</w:t>
-      </w:r>
-      <w:r>
-        <w:rPr>
-          <w:szCs w:val="28"/>
-          <w:lang w:val="uk-UA"/>
-        </w:rPr>
-        <w:t>.</w:t>
-      </w:r>
-      <w:r>
-        <w:rPr>
-          <w:lang w:val="uk-UA"/>
-        </w:rPr>
-        <w:t xml:space="preserve"> </w:t>
-      </w:r>
-      <w:r>
-        <w:rPr>
-          <w:lang w:val="uk-UA"/>
-        </w:rPr>
-        <w:t>Зарахувати</w:t>
-      </w:r>
-      <w:r>
-        <w:rPr>
-          <w:lang w:val="uk-UA"/>
-        </w:rPr>
-        <w:t xml:space="preserve"> на продовольче забезпечення з </w:t>
-      </w:r>
-      <w:r>
-        <w:rPr>
+          <w:highlight w:val="yellow"/>
+          <w:lang w:val="uk-UA"/>
+        </w:rPr>
+      </w:pPr>
+      <w:r>
+        <w:rPr>
+          <w:szCs w:val="28"/>
+          <w:highlight w:val="yellow"/>
+          <w:lang w:val="uk-UA"/>
+        </w:rPr>
+        <w:t>Вважати такими, що прибули до складу сил і засобів 2 корпусу Національної гвардії України "Хартія" та приступили до виконання службових обов'язків.</w:t>
+      </w:r>
+      <w:r>
+        <w:rPr>
+          <w:highlight w:val="yellow"/>
+          <w:lang w:val="uk-UA"/>
+        </w:rPr>
+        <w:t xml:space="preserve"> Зарахувати на продовольче забезпечення з {</w:t>
+      </w:r>
+      <w:r>
+        <w:rPr>
+          <w:highlight w:val="yellow"/>
+        </w:rPr>
+        <w:t>dd</w:t>
+      </w:r>
+      <w:r>
+        <w:rPr>
+          <w:highlight w:val="yellow"/>
+          <w:lang w:val="uk-UA"/>
+        </w:rPr>
+        <w:t>} </w:t>
+      </w:r>
+      <w:r>
+        <w:rPr>
+          <w:szCs w:val="28"/>
+          <w:highlight w:val="yellow"/>
           <w:lang w:val="uk-UA"/>
         </w:rPr>
         <w:t>{</w:t>
       </w:r>
       <w:r>
-        <w:t>dd</w:t>
-      </w:r>
-      <w:r>
-        <w:rPr>
+        <w:rPr>
+          <w:szCs w:val="28"/>
+          <w:highlight w:val="yellow"/>
+        </w:rPr>
+        <w:t>month</w:t>
+      </w:r>
+      <w:r>
+        <w:rPr>
+          <w:szCs w:val="28"/>
+          <w:highlight w:val="yellow"/>
+          <w:lang w:val="uk-UA"/>
+        </w:rPr>
+        <w:t>} {</w:t>
+      </w:r>
+      <w:r>
+        <w:rPr>
+          <w:szCs w:val="28"/>
+          <w:highlight w:val="yellow"/>
+        </w:rPr>
+        <w:t>yyyy</w:t>
+      </w:r>
+      <w:r>
+        <w:rPr>
+          <w:szCs w:val="28"/>
+          <w:highlight w:val="yellow"/>
           <w:lang w:val="uk-UA"/>
         </w:rPr>
         <w:t>}</w:t>
       </w:r>
       <w:r>
         <w:rPr>
-          <w:lang w:val="uk-UA"/>
+          <w:szCs w:val="28"/>
+          <w:highlight w:val="yellow"/>
         </w:rPr>
         <w:t> </w:t>
       </w:r>
       <w:r>
         <w:rPr>
-          <w:szCs w:val="28"/>
-          <w:lang w:val="uk-UA"/>
-        </w:rPr>
-        <w:t>{</w:t>
-      </w:r>
-      <w:r>
-        <w:rPr>
-          <w:szCs w:val="28"/>
-        </w:rPr>
-        <w:t>month</w:t>
-      </w:r>
-      <w:r>
-        <w:rPr>
-          <w:szCs w:val="28"/>
-          <w:lang w:val="uk-UA"/>
-        </w:rPr>
-        <w:t>}</w:t>
-      </w:r>
-      <w:r>
-        <w:rPr>
-          <w:szCs w:val="28"/>
-          <w:lang w:val="uk-UA"/>
-        </w:rPr>
-        <w:t xml:space="preserve"> </w:t>
-      </w:r>
-      <w:r>
-        <w:rPr>
-          <w:szCs w:val="28"/>
-          <w:lang w:val="uk-UA"/>
-        </w:rPr>
-        <w:t>{</w:t>
-      </w:r>
-      <w:r>
-        <w:rPr>
-          <w:szCs w:val="28"/>
-        </w:rPr>
-        <w:t>yyyy</w:t>
-      </w:r>
-      <w:r>
-        <w:rPr>
-          <w:szCs w:val="28"/>
-          <w:lang w:val="uk-UA"/>
-        </w:rPr>
-        <w:t>}</w:t>
-      </w:r>
-      <w:r>
-        <w:rPr>
-          <w:szCs w:val="28"/>
-        </w:rPr>
-        <w:t> </w:t>
-      </w:r>
-      <w:r>
-        <w:rPr>
+          <w:highlight w:val="yellow"/>
           <w:lang w:val="uk-UA"/>
         </w:rPr>
         <w:t>року</w:t>
@@ -837,6 +800,7 @@
       <w:r>
         <w:rPr>
           <w:szCs w:val="28"/>
+          <w:highlight w:val="yellow"/>
           <w:lang w:val="uk-UA"/>
         </w:rPr>
         <w:t>:</w:t>
@@ -1050,6 +1014,7 @@
         <w:rPr>
           <w:lang w:val="uk-UA"/>
         </w:rPr>
+        <w:lastRenderedPageBreak/>
         <w:t>{\block:FromVacationForCuring_Begin}</w:t>
       </w:r>
     </w:p>
@@ -1104,7 +1069,6 @@
         <w:rPr>
           <w:lang w:val="uk-UA"/>
         </w:rPr>
-        <w:lastRenderedPageBreak/>
         <w:t>{\export:FromVacationForCuring_End}</w:t>
       </w:r>
     </w:p>
@@ -1545,6 +1509,34 @@
     <w:p/>
     <w:p>
       <w:pPr>
+        <w:ind w:firstLine="0"/>
+        <w:rPr>
+          <w:lang w:val="uk-UA"/>
+        </w:rPr>
+      </w:pPr>
+      <w:r>
+        <w:rPr>
+          <w:lang w:val="uk-UA"/>
+        </w:rPr>
+        <w:t>{\root:OrderSection3_End}</w:t>
+      </w:r>
+    </w:p>
+    <w:p>
+      <w:pPr>
+        <w:ind w:firstLine="0"/>
+        <w:rPr>
+          <w:lang w:val="uk-UA"/>
+        </w:rPr>
+      </w:pPr>
+      <w:r>
+        <w:rPr>
+          <w:lang w:val="uk-UA"/>
+        </w:rPr>
+        <w:t>{\root:OrderSection4_Begin}</w:t>
+      </w:r>
+    </w:p>
+    <w:p>
+      <w:pPr>
         <w:pStyle w:val="ListParagraph"/>
         <w:numPr>
           <w:ilvl w:val="0"/>
@@ -1625,13 +1617,6 @@
         </w:rPr>
         <w:t>З медичної роти військової частини А7383:</w:t>
       </w:r>
-      <w:r>
-        <w:rPr>
-          <w:highlight w:val="yellow"/>
-          <w:lang w:val="uk-UA"/>
-        </w:rPr>
-        <w:t/>
-      </w:r>
     </w:p>
     <w:p>
       <w:pPr>
@@ -1733,6 +1718,34 @@
           <w:lang w:val="uk-UA"/>
         </w:rPr>
         <w:t>СЗЧ</w:t>
+      </w:r>
+    </w:p>
+    <w:p>
+      <w:pPr>
+        <w:ind w:firstLine="0"/>
+        <w:rPr>
+          <w:lang w:val="uk-UA"/>
+        </w:rPr>
+      </w:pPr>
+      <w:r>
+        <w:rPr>
+          <w:lang w:val="uk-UA"/>
+        </w:rPr>
+        <w:t>{\root:OrderSection4_End}</w:t>
+      </w:r>
+    </w:p>
+    <w:p>
+      <w:pPr>
+        <w:ind w:firstLine="0"/>
+        <w:rPr>
+          <w:lang w:val="uk-UA"/>
+        </w:rPr>
+      </w:pPr>
+      <w:r>
+        <w:rPr>
+          <w:lang w:val="uk-UA"/>
+        </w:rPr>
+        <w:t>{\root:OrderSection5_Begin}</w:t>
       </w:r>
     </w:p>
     <w:p>
@@ -1744,6 +1757,7 @@
         </w:numPr>
         <w:rPr>
           <w:szCs w:val="28"/>
+          <w:highlight w:val="yellow"/>
           <w:lang w:val="uk-UA"/>
         </w:rPr>
       </w:pPr>
@@ -1751,13 +1765,16 @@
         <w:rPr>
           <w:rFonts w:cs="Times New Roman"/>
           <w:szCs w:val="28"/>
-          <w:lang w:val="uk-UA"/>
-        </w:rPr>
+          <w:highlight w:val="yellow"/>
+          <w:lang w:val="uk-UA"/>
+        </w:rPr>
+        <w:lastRenderedPageBreak/>
         <w:t xml:space="preserve">Вважати такими, що вибули зі складу сил 2 корпусу Національної гвардії України "Хартія". Зняти з продовольчого забезпечення </w:t>
       </w:r>
       <w:r>
         <w:rPr>
           <w:szCs w:val="28"/>
+          <w:highlight w:val="yellow"/>
           <w:lang w:val="uk-UA"/>
         </w:rPr>
         <w:t>з</w:t>
@@ -1765,6 +1782,7 @@
       <w:r>
         <w:rPr>
           <w:szCs w:val="28"/>
+          <w:highlight w:val="yellow"/>
         </w:rPr>
         <w:t> </w:t>
       </w:r>
@@ -1772,6 +1790,7 @@
         <w:rPr>
           <w:color w:val="000000" w:themeColor="text1"/>
           <w:szCs w:val="28"/>
+          <w:highlight w:val="yellow"/>
           <w:lang w:val="uk-UA"/>
         </w:rPr>
         <w:t>{</w:t>
@@ -1780,6 +1799,7 @@
         <w:rPr>
           <w:color w:val="000000" w:themeColor="text1"/>
           <w:szCs w:val="28"/>
+          <w:highlight w:val="yellow"/>
         </w:rPr>
         <w:t>dd</w:t>
       </w:r>
@@ -1787,6 +1807,7 @@
         <w:rPr>
           <w:color w:val="000000" w:themeColor="text1"/>
           <w:szCs w:val="28"/>
+          <w:highlight w:val="yellow"/>
           <w:lang w:val="uk-UA"/>
         </w:rPr>
         <w:t>}</w:t>
@@ -1794,12 +1815,14 @@
       <w:r>
         <w:rPr>
           <w:szCs w:val="28"/>
+          <w:highlight w:val="yellow"/>
         </w:rPr>
         <w:t> </w:t>
       </w:r>
       <w:r>
         <w:rPr>
           <w:szCs w:val="28"/>
+          <w:highlight w:val="yellow"/>
           <w:lang w:val="uk-UA"/>
         </w:rPr>
         <w:t>{</w:t>
@@ -1807,12 +1830,29 @@
       <w:r>
         <w:rPr>
           <w:szCs w:val="28"/>
+          <w:highlight w:val="yellow"/>
         </w:rPr>
         <w:t>month</w:t>
       </w:r>
       <w:r>
         <w:rPr>
           <w:szCs w:val="28"/>
+          <w:highlight w:val="yellow"/>
+          <w:lang w:val="uk-UA"/>
+        </w:rPr>
+        <w:t>} {</w:t>
+      </w:r>
+      <w:r>
+        <w:rPr>
+          <w:szCs w:val="28"/>
+          <w:highlight w:val="yellow"/>
+        </w:rPr>
+        <w:t>yyyy</w:t>
+      </w:r>
+      <w:r>
+        <w:rPr>
+          <w:szCs w:val="28"/>
+          <w:highlight w:val="yellow"/>
           <w:lang w:val="uk-UA"/>
         </w:rPr>
         <w:t>}</w:t>
@@ -1820,39 +1860,14 @@
       <w:r>
         <w:rPr>
           <w:szCs w:val="28"/>
-          <w:lang w:val="uk-UA"/>
-        </w:rPr>
-        <w:t xml:space="preserve"> </w:t>
-      </w:r>
-      <w:r>
-        <w:rPr>
-          <w:szCs w:val="28"/>
-          <w:lang w:val="uk-UA"/>
-        </w:rPr>
-        <w:t>{</w:t>
-      </w:r>
-      <w:r>
-        <w:rPr>
-          <w:szCs w:val="28"/>
-        </w:rPr>
-        <w:t>yyyy</w:t>
-      </w:r>
-      <w:r>
-        <w:rPr>
-          <w:szCs w:val="28"/>
-          <w:lang w:val="uk-UA"/>
-        </w:rPr>
-        <w:t>}</w:t>
-      </w:r>
-      <w:r>
-        <w:rPr>
-          <w:szCs w:val="28"/>
+          <w:highlight w:val="yellow"/>
         </w:rPr>
         <w:t> </w:t>
       </w:r>
       <w:r>
         <w:rPr>
           <w:szCs w:val="28"/>
+          <w:highlight w:val="yellow"/>
           <w:lang w:val="uk-UA"/>
         </w:rPr>
         <w:t>року</w:t>
@@ -1860,6 +1875,7 @@
       <w:r>
         <w:rPr>
           <w:szCs w:val="28"/>
+          <w:highlight w:val="yellow"/>
           <w:lang w:val="uk-UA"/>
         </w:rPr>
         <w:t>:</w:t>
@@ -2425,6 +2441,34 @@
     <w:p/>
     <w:p>
       <w:pPr>
+        <w:ind w:firstLine="0"/>
+        <w:rPr>
+          <w:lang w:val="uk-UA"/>
+        </w:rPr>
+      </w:pPr>
+      <w:r>
+        <w:rPr>
+          <w:lang w:val="uk-UA"/>
+        </w:rPr>
+        <w:t>{\root:OrderSection5_End}</w:t>
+      </w:r>
+    </w:p>
+    <w:p>
+      <w:pPr>
+        <w:ind w:firstLine="0"/>
+        <w:rPr>
+          <w:lang w:val="uk-UA"/>
+        </w:rPr>
+      </w:pPr>
+      <w:r>
+        <w:rPr>
+          <w:lang w:val="uk-UA"/>
+        </w:rPr>
+        <w:t>{\root:OrderSection6_Begin}</w:t>
+      </w:r>
+    </w:p>
+    <w:p>
+      <w:pPr>
         <w:pStyle w:val="ListParagraph"/>
         <w:numPr>
           <w:ilvl w:val="0"/>
@@ -2488,32 +2532,24 @@
         </w:rPr>
         <w:t>На лікування до медичної роти військової частини А7383:</w:t>
       </w:r>
-      <w:r>
-        <w:rPr>
-          <w:highlight w:val="yellow"/>
-          <w:lang w:val="uk-UA"/>
-        </w:rPr>
-        <w:t/>
-      </w:r>
-    </w:p>
-    <w:p>
-      <w:pPr>
-        <w:rPr>
-          <w:lang w:val="uk-UA"/>
-        </w:rPr>
-      </w:pPr>
-    </w:p>
-    <w:p>
-      <w:pPr>
-        <w:rPr>
-          <w:lang w:val="uk-UA"/>
-        </w:rPr>
-      </w:pPr>
-      <w:r>
-        <w:rPr>
-          <w:lang w:val="uk-UA"/>
-        </w:rPr>
-        <w:lastRenderedPageBreak/>
+    </w:p>
+    <w:p>
+      <w:pPr>
+        <w:rPr>
+          <w:lang w:val="uk-UA"/>
+        </w:rPr>
+      </w:pPr>
+    </w:p>
+    <w:p>
+      <w:pPr>
+        <w:rPr>
+          <w:lang w:val="uk-UA"/>
+        </w:rPr>
+      </w:pPr>
+      <w:r>
+        <w:rPr>
+          <w:lang w:val="uk-UA"/>
+        </w:rPr>
         <w:t>{\export:</w:t>
       </w:r>
       <w:r>
@@ -2667,6 +2703,20 @@
         <w:rPr>
           <w:lang w:val="uk-UA"/>
         </w:rPr>
+        <w:t>{\root:OrderSection6_End}</w:t>
+      </w:r>
+    </w:p>
+    <w:p>
+      <w:pPr>
+        <w:ind w:firstLine="0"/>
+        <w:rPr>
+          <w:lang w:val="uk-UA"/>
+        </w:rPr>
+      </w:pPr>
+      <w:r>
+        <w:rPr>
+          <w:lang w:val="uk-UA"/>
+        </w:rPr>
         <w:t>{\block:MoveFromHospitalToVacationForCuring_Begin}</w:t>
       </w:r>
     </w:p>
@@ -2873,6 +2923,7 @@
         <w:rPr>
           <w:lang w:val="uk-UA"/>
         </w:rPr>
+        <w:lastRenderedPageBreak/>
         <w:t>{\block:MoveFromMedicalCompanyVacationForCuringToVacationForCuring_End}</w:t>
       </w:r>
     </w:p>
@@ -3402,6 +3453,7 @@
         <w:rPr>
           <w:lang w:val="uk-UA"/>
         </w:rPr>
+        <w:lastRenderedPageBreak/>
         <w:t>{\export:MoveFromVacationForCuringToVlk_End}</w:t>
       </w:r>
     </w:p>
@@ -4035,6 +4087,7 @@
         <w:rPr>
           <w:lang w:val="uk-UA"/>
         </w:rPr>
+        <w:lastRenderedPageBreak/>
         <w:t>{\export:MoveFromFamilyVacationToVlk_End}</w:t>
       </w:r>
     </w:p>

</xml_diff>

<commit_message>
Add annual vacation continuation and fix event editing UI
</commit_message>
<xml_diff>
--- a/PROJECTS_EXCEL/workbook/PersonalEventBuilder/{yyyy}-{mm}-{dd} №{OrderNum} ({Signatory}) (Александр).docx
+++ b/PROJECTS_EXCEL/workbook/PersonalEventBuilder/{yyyy}-{mm}-{dd} №{OrderNum} ({Signatory}) (Александр).docx
@@ -2759,6 +2759,61 @@
           <w:lang w:val="uk-UA"/>
         </w:rPr>
         <w:t>{\block:MoveFromHospitalToVacationForCuring_End}</w:t>
+      </w:r>
+    </w:p>
+    <w:p>
+      <w:pPr>
+        <w:ind w:firstLine="0"/>
+        <w:rPr>
+          <w:lang w:val="uk-UA"/>
+        </w:rPr>
+      </w:pPr>
+      <w:r>
+        <w:rPr>
+          <w:lang w:val="uk-UA"/>
+        </w:rPr>
+        <w:t>{\block:MoveFromHospitalToAnnualVacationContinuation_Begin}</w:t>
+      </w:r>
+    </w:p>
+    <w:p/>
+    <w:p>
+      <w:pPr>
+        <w:rPr>
+          <w:lang w:val="uk-UA"/>
+        </w:rPr>
+      </w:pPr>
+      <w:r>
+        <w:rPr>
+          <w:lang w:val="uk-UA"/>
+        </w:rPr>
+        <w:t>{\export:MoveFromHospitalToAnnualVacationContinuation_Begin}</w:t>
+      </w:r>
+    </w:p>
+    <w:p>
+      <w:pPr>
+        <w:rPr>
+          <w:lang w:val="uk-UA"/>
+        </w:rPr>
+      </w:pPr>
+      <w:r>
+        <w:rPr>
+          <w:lang w:val="uk-UA"/>
+        </w:rPr>
+        <w:t>{\export:MoveFromHospitalToAnnualVacationContinuation_End}</w:t>
+      </w:r>
+    </w:p>
+    <w:p>
+      <w:pPr>
+        <w:ind w:firstLine="0"/>
+        <w:rPr>
+          <w:lang w:val="uk-UA"/>
+        </w:rPr>
+      </w:pPr>
+      <w:r>
+        <w:rPr>
+          <w:lang w:val="uk-UA"/>
+        </w:rPr>
+        <w:t>{\block:MoveFromHospitalToAnnualVacationContinuation_End}</w:t>
       </w:r>
     </w:p>
     <w:p>

</xml_diff>